<commit_message>
Updates to pipeline and thesis
</commit_message>
<xml_diff>
--- a/docs/TFM_master.docx
+++ b/docs/TFM_master.docx
@@ -20,6 +20,9 @@
       <w:sdtContent>
         <w:p>
           <w:r>
+            <w:rPr>
+              <w:noProof/>
+            </w:rPr>
             <mc:AlternateContent>
               <mc:Choice Requires="wps">
                 <w:drawing>
@@ -90,8 +93,8 @@
                                   <w:tblDescription w:val="Cover page info"/>
                                 </w:tblPr>
                                 <w:tblGrid>
-                                  <w:gridCol w:w="819"/>
-                                  <w:gridCol w:w="10248"/>
+                                  <w:gridCol w:w="796"/>
+                                  <w:gridCol w:w="9966"/>
                                 </w:tblGrid>
                                 <w:tr>
                                   <w:trPr>
@@ -368,8 +371,8 @@
                             <w:tblDescription w:val="Cover page info"/>
                           </w:tblPr>
                           <w:tblGrid>
-                            <w:gridCol w:w="819"/>
-                            <w:gridCol w:w="10248"/>
+                            <w:gridCol w:w="796"/>
+                            <w:gridCol w:w="9966"/>
                           </w:tblGrid>
                           <w:tr>
                             <w:trPr>
@@ -632,6 +635,9 @@
             <w:br w:type="page"/>
           </w:r>
           <w:r>
+            <w:rPr>
+              <w:noProof/>
+            </w:rPr>
             <w:drawing>
               <wp:anchor distT="0" distB="0" distL="114300" distR="114300" simplePos="0" relativeHeight="251693056" behindDoc="0" locked="0" layoutInCell="1" allowOverlap="1" wp14:anchorId="371F495C" wp14:editId="663FC23F">
                 <wp:simplePos x="0" y="0"/>
@@ -1775,16 +1781,7 @@
           <w:bCs/>
           <w:color w:val="7CCA62" w:themeColor="accent5"/>
         </w:rPr>
-        <w:t xml:space="preserve">Data preparation. </w:t>
-      </w:r>
-      <w:r>
-        <w:rPr>
-          <w:rFonts w:cs="Calibri"/>
-          <w:b/>
-          <w:bCs/>
-          <w:color w:val="7CCA62" w:themeColor="accent5"/>
-        </w:rPr>
-        <w:t>Explore two types of models:</w:t>
+        <w:t>Data preparation. Explore two types of models:</w:t>
       </w:r>
     </w:p>
     <w:p>
@@ -1948,17 +1945,26 @@
         <w:spacing w:before="240"/>
         <w:rPr>
           <w:rFonts w:cs="Calibri"/>
-        </w:rPr>
-      </w:pPr>
-      <w:r>
-        <w:rPr>
-          <w:rFonts w:cs="Calibri"/>
+          <w:b/>
+          <w:bCs/>
+          <w:color w:val="7CCA62" w:themeColor="accent5"/>
+        </w:rPr>
+      </w:pPr>
+      <w:r>
+        <w:rPr>
+          <w:rFonts w:cs="Calibri"/>
+          <w:b/>
+          <w:bCs/>
+          <w:color w:val="7CCA62" w:themeColor="accent5"/>
         </w:rPr>
         <w:t xml:space="preserve">Appendix: </w:t>
       </w:r>
       <w:r>
         <w:rPr>
           <w:rFonts w:cs="Calibri"/>
+          <w:b/>
+          <w:bCs/>
+          <w:color w:val="7CCA62" w:themeColor="accent5"/>
         </w:rPr>
         <w:t>full page pictures</w:t>
       </w:r>
@@ -5172,21 +5178,7 @@
                 <w:rStyle w:val="Hyperlink"/>
                 <w:noProof/>
               </w:rPr>
-              <w:t>Indicato</w:t>
-            </w:r>
-            <w:r>
-              <w:rPr>
-                <w:rStyle w:val="Hyperlink"/>
-                <w:noProof/>
-              </w:rPr>
-              <w:t>r</w:t>
-            </w:r>
-            <w:r>
-              <w:rPr>
-                <w:rStyle w:val="Hyperlink"/>
-                <w:noProof/>
-              </w:rPr>
-              <w:t>s scaling</w:t>
+              <w:t>Indicators scaling</w:t>
             </w:r>
             <w:r>
               <w:rPr>
@@ -5281,7 +5273,23 @@
                 <w:noProof/>
                 <w:lang w:eastAsia="es-ES"/>
               </w:rPr>
-              <w:t>Model creation (Supervised learning)</w:t>
+              <w:t xml:space="preserve">Model </w:t>
+            </w:r>
+            <w:r>
+              <w:rPr>
+                <w:rStyle w:val="Hyperlink"/>
+                <w:noProof/>
+                <w:lang w:eastAsia="es-ES"/>
+              </w:rPr>
+              <w:t>c</w:t>
+            </w:r>
+            <w:r>
+              <w:rPr>
+                <w:rStyle w:val="Hyperlink"/>
+                <w:noProof/>
+                <w:lang w:eastAsia="es-ES"/>
+              </w:rPr>
+              <w:t>reation (Supervised learning)</w:t>
             </w:r>
             <w:r>
               <w:rPr>
@@ -5756,23 +5764,7 @@
                 <w:noProof/>
                 <w:lang w:eastAsia="es-ES"/>
               </w:rPr>
-              <w:t>Clu</w:t>
-            </w:r>
-            <w:r>
-              <w:rPr>
-                <w:rStyle w:val="Hyperlink"/>
-                <w:noProof/>
-                <w:lang w:eastAsia="es-ES"/>
-              </w:rPr>
-              <w:t>s</w:t>
-            </w:r>
-            <w:r>
-              <w:rPr>
-                <w:rStyle w:val="Hyperlink"/>
-                <w:noProof/>
-                <w:lang w:eastAsia="es-ES"/>
-              </w:rPr>
-              <w:t>tering methods (Unsupervised learning)</w:t>
+              <w:t>Clustering methods (Unsupervised learning)</w:t>
             </w:r>
             <w:r>
               <w:rPr>
@@ -6169,6 +6161,9 @@
         </w:rPr>
       </w:pPr>
       <w:r>
+        <w:rPr>
+          <w:noProof/>
+        </w:rPr>
         <mc:AlternateContent>
           <mc:Choice Requires="wps">
             <w:drawing>
@@ -6216,8 +6211,8 @@
                                 <w:lang w:val="en-GB"/>
                               </w:rPr>
                             </w:pPr>
-                            <w:bookmarkStart w:id="4" w:name="_Ref234323676"/>
-                            <w:bookmarkStart w:id="5" w:name="_Ref234323685"/>
+                            <w:bookmarkStart w:id="4" w:name="_Ref234323685"/>
+                            <w:bookmarkStart w:id="5" w:name="_Ref234323676"/>
                             <w:r>
                               <w:rPr>
                                 <w:lang w:val="en-GB"/>
@@ -6290,7 +6285,7 @@
                               </w:rPr>
                               <w:fldChar w:fldCharType="end"/>
                             </w:r>
-                            <w:bookmarkEnd w:id="5"/>
+                            <w:bookmarkEnd w:id="4"/>
                             <w:r>
                               <w:rPr>
                                 <w:lang w:val="en-GB"/>
@@ -6309,7 +6304,7 @@
                               </w:rPr>
                               <w:t>, where “Prevalence” refers to the proportion of individuals in a population who have a particular disease or condition at a specific point in time or over a defined period.</w:t>
                             </w:r>
-                            <w:bookmarkEnd w:id="4"/>
+                            <w:bookmarkEnd w:id="5"/>
                           </w:p>
                         </w:txbxContent>
                       </wps:txbx>
@@ -6340,8 +6335,8 @@
                           <w:lang w:val="en-GB"/>
                         </w:rPr>
                       </w:pPr>
-                      <w:bookmarkStart w:id="6" w:name="_Ref234323676"/>
-                      <w:bookmarkStart w:id="7" w:name="_Ref234323685"/>
+                      <w:bookmarkStart w:id="6" w:name="_Ref234323685"/>
+                      <w:bookmarkStart w:id="7" w:name="_Ref234323676"/>
                       <w:r>
                         <w:rPr>
                           <w:lang w:val="en-GB"/>
@@ -6414,7 +6409,7 @@
                         </w:rPr>
                         <w:fldChar w:fldCharType="end"/>
                       </w:r>
-                      <w:bookmarkEnd w:id="7"/>
+                      <w:bookmarkEnd w:id="6"/>
                       <w:r>
                         <w:rPr>
                           <w:lang w:val="en-GB"/>
@@ -6433,7 +6428,7 @@
                         </w:rPr>
                         <w:t>, where “Prevalence” refers to the proportion of individuals in a population who have a particular disease or condition at a specific point in time or over a defined period.</w:t>
                       </w:r>
-                      <w:bookmarkEnd w:id="6"/>
+                      <w:bookmarkEnd w:id="7"/>
                     </w:p>
                   </w:txbxContent>
                 </v:textbox>
@@ -6446,6 +6441,7 @@
       <w:r>
         <w:rPr>
           <w:rFonts w:cs="Calibri"/>
+          <w:noProof/>
         </w:rPr>
         <w:drawing>
           <wp:anchor distT="0" distB="0" distL="114300" distR="114300" simplePos="0" relativeHeight="251636736" behindDoc="0" locked="0" layoutInCell="1" allowOverlap="1" wp14:anchorId="46FE5E10" wp14:editId="25B6EAAD">
@@ -6742,19 +6738,7 @@
         <w:rPr>
           <w:rFonts w:cs="Calibri"/>
         </w:rPr>
-        <w:t xml:space="preserve">These </w:t>
-      </w:r>
-      <w:r>
-        <w:rPr>
-          <w:rFonts w:cs="Calibri"/>
-        </w:rPr>
-        <w:t>numbers</w:t>
-      </w:r>
-      <w:r>
-        <w:rPr>
-          <w:rFonts w:cs="Calibri"/>
-        </w:rPr>
-        <w:t xml:space="preserve"> illustrate the enormous economic burden that poor mental health places on societies, driven mainly by reduced labour productivity, increased healthcare spending, and social benefit payments.</w:t>
+        <w:t>These numbers illustrate the enormous economic burden that poor mental health places on societies, driven mainly by reduced labour productivity, increased healthcare spending, and social benefit payments.</w:t>
       </w:r>
       <w:r>
         <w:rPr>
@@ -6828,15 +6812,7 @@
         <w:fldChar w:fldCharType="separate"/>
       </w:r>
       <w:r>
-        <w:t>(</w:t>
-      </w:r>
-      <w:proofErr w:type="spellStart"/>
-      <w:r>
-        <w:t>Pirkis</w:t>
-      </w:r>
-      <w:proofErr w:type="spellEnd"/>
-      <w:r>
-        <w:t xml:space="preserve"> et al., 2024; World Health Organization, 2025a)</w:t>
+        <w:t>(Pirkis et al., 2024; World Health Organization, 2025a)</w:t>
       </w:r>
       <w:r>
         <w:rPr>
@@ -6926,15 +6902,7 @@
         <w:fldChar w:fldCharType="separate"/>
       </w:r>
       <w:r>
-        <w:t>(</w:t>
-      </w:r>
-      <w:proofErr w:type="spellStart"/>
-      <w:r>
-        <w:t>Pirkis</w:t>
-      </w:r>
-      <w:proofErr w:type="spellEnd"/>
-      <w:r>
-        <w:t xml:space="preserve"> et al., 2024)</w:t>
+        <w:t>(Pirkis et al., 2024)</w:t>
       </w:r>
       <w:r>
         <w:rPr>
@@ -6961,13 +6929,7 @@
         <w:rPr>
           <w:rFonts w:cs="Calibri"/>
         </w:rPr>
-        <w:t>Consequently, the actual number of suicide deaths could be higher than estimated, further reinforcing the severity of this phenomenon, which accounts for 1% of all deaths worldwide</w:t>
-      </w:r>
-      <w:r>
-        <w:rPr>
-          <w:rFonts w:cs="Calibri"/>
-        </w:rPr>
-        <w:t xml:space="preserve"> </w:t>
+        <w:t xml:space="preserve">Consequently, the actual number of suicide deaths could be higher than estimated, further reinforcing the severity of this phenomenon, which accounts for 1% of all deaths worldwide </w:t>
       </w:r>
       <w:r>
         <w:rPr>
@@ -7036,15 +6998,7 @@
         <w:fldChar w:fldCharType="separate"/>
       </w:r>
       <w:r>
-        <w:t xml:space="preserve">(Nadeem </w:t>
-      </w:r>
-      <w:proofErr w:type="spellStart"/>
-      <w:r>
-        <w:t>Parpio</w:t>
-      </w:r>
-      <w:proofErr w:type="spellEnd"/>
-      <w:r>
-        <w:t xml:space="preserve"> et al., 2025)</w:t>
+        <w:t>(Nadeem Parpio et al., 2025)</w:t>
       </w:r>
       <w:r>
         <w:rPr>
@@ -7092,15 +7046,7 @@
         <w:fldChar w:fldCharType="separate"/>
       </w:r>
       <w:r>
-        <w:t xml:space="preserve">(Nadeem </w:t>
-      </w:r>
-      <w:proofErr w:type="spellStart"/>
-      <w:r>
-        <w:t>Parpio</w:t>
-      </w:r>
-      <w:proofErr w:type="spellEnd"/>
-      <w:r>
-        <w:t xml:space="preserve"> et al., 2025)</w:t>
+        <w:t>(Nadeem Parpio et al., 2025)</w:t>
       </w:r>
       <w:r>
         <w:rPr>
@@ -7136,6 +7082,7 @@
       <w:r>
         <w:rPr>
           <w:rFonts w:cs="Calibri"/>
+          <w:noProof/>
         </w:rPr>
         <w:drawing>
           <wp:anchor distT="0" distB="0" distL="114300" distR="114300" simplePos="0" relativeHeight="251637760" behindDoc="0" locked="0" layoutInCell="1" allowOverlap="1" wp14:anchorId="4A89C7CF" wp14:editId="7555B01B">
@@ -7194,6 +7141,9 @@
         </w:drawing>
       </w:r>
       <w:r>
+        <w:rPr>
+          <w:noProof/>
+        </w:rPr>
         <mc:AlternateContent>
           <mc:Choice Requires="wps">
             <w:drawing>
@@ -7469,12 +7419,12 @@
         <w:rPr>
           <w:rFonts w:cs="Calibri"/>
         </w:rPr>
-      </w:r>
-      <w:r>
-        <w:rPr>
-          <w:rFonts w:cs="Calibri"/>
-        </w:rPr>
         <w:instrText xml:space="preserve"> \* MERGEFORMAT </w:instrText>
+      </w:r>
+      <w:r>
+        <w:rPr>
+          <w:rFonts w:cs="Calibri"/>
+        </w:rPr>
       </w:r>
       <w:r>
         <w:rPr>
@@ -7587,91 +7537,49 @@
         <w:rPr>
           <w:rFonts w:cs="Times New Roman"/>
         </w:rPr>
-        <w:t xml:space="preserve">(Hawton &amp; </w:t>
-      </w:r>
-      <w:proofErr w:type="spellStart"/>
+        <w:t>(Hawton &amp; Pirkis, 2024; O’Connor et al., 2024)</w:t>
+      </w:r>
+      <w:r>
+        <w:rPr>
+          <w:rFonts w:cs="Calibri"/>
+        </w:rPr>
+        <w:fldChar w:fldCharType="end"/>
+      </w:r>
+      <w:r>
+        <w:rPr>
+          <w:rFonts w:cs="Calibri"/>
+        </w:rPr>
+        <w:t xml:space="preserve">. </w:t>
+      </w:r>
+      <w:r>
+        <w:rPr>
+          <w:rFonts w:cs="Calibri"/>
+        </w:rPr>
+        <w:t xml:space="preserve">Factors such as income level, unemployment, violence, social isolation, substance abuse, and discrimination thus exert a decisive influence on the development of suicide risk </w:t>
+      </w:r>
+      <w:r>
+        <w:rPr>
+          <w:rFonts w:cs="Calibri"/>
+        </w:rPr>
+        <w:fldChar w:fldCharType="begin"/>
+      </w:r>
+      <w:r>
+        <w:rPr>
+          <w:rFonts w:cs="Calibri"/>
+        </w:rPr>
+        <w:instrText xml:space="preserve"> ADDIN ZOTERO_ITEM CSL_CITATION {"citationID":"caymOgRh","properties":{"unsorted":false,"formattedCitation":"(Hawton &amp; Pirkis, 2024; O\\uc0\\u8217{}Connor et al., 2024; Pirkis et al., 2024)","plainCitation":"(Hawton &amp; Pirkis, 2024; O’Connor et al., 2024; Pirkis et al., 2024)","noteIndex":0},"citationItems":[{"id":4,"uris":["http://zotero.org/users/local/Q88HxZOk/items/MQEQQ4AS"],"itemData":{"id":4,"type":"article-journal","container-title":"The Lancet Public Health","DOI":"10.1016/S2468-2667(24)00159-2","ISSN":"24682667","issue":"10","journalAbbreviation":"The Lancet Public Health","language":"en","page":"e825-e830","source":"DOI.org (Crossref)","title":"Preventing suicide: a call to action","title-short":"Preventing suicide","volume":"9","author":[{"family":"Hawton","given":"Keith"},{"family":"Pirkis","given":"Jane"}],"issued":{"date-parts":[["2024",10]]}}},{"id":10,"uris":["http://zotero.org/users/local/Q88HxZOk/items/Y25DZ3CA"],"itemData":{"id":10,"type":"article-journal","container-title":"The Lancet Public Health","DOI":"10.1016/S2468-2667(24)00217-2","ISSN":"24682667","issue":"10","journalAbbreviation":"The Lancet Public Health","language":"en","page":"e714-e715","source":"DOI.org (Crossref)","title":"Preventing suicide: understanding the complex interplay between individual and societal factors","title-short":"Preventing suicide","volume":"9","author":[{"family":"O'Connor","given":"Rory C"},{"family":"Kirtley","given":"Olivia J"},{"family":"De Beurs","given":"Derek"}],"issued":{"date-parts":[["2024",10]]}}},{"id":12,"uris":["http://zotero.org/users/local/Q88HxZOk/items/BNZKK4FD"],"itemData":{"id":12,"type":"article-journal","container-title":"The Lancet Public Health","DOI":"10.1016/S2468-2667(24)00149-X","ISSN":"24682667","issue":"10","journalAbbreviation":"The Lancet Public Health","language":"en","page":"e787-e795","source":"DOI.org (Crossref)","title":"Preventing suicide: a public health approach to a global problem","title-short":"Preventing suicide","volume":"9","author":[{"family":"Pirkis","given":"Jane"},{"family":"Dandona","given":"Rakhi"},{"family":"Silverman","given":"Morton"},{"family":"Khan","given":"Murad"},{"family":"Hawton","given":"Keith"}],"issued":{"date-parts":[["2024",10]]}}}],"schema":"https://github.com/citation-style-language/schema/raw/master/csl-citation.json"} </w:instrText>
+      </w:r>
+      <w:r>
+        <w:rPr>
+          <w:rFonts w:cs="Calibri"/>
+        </w:rPr>
+        <w:fldChar w:fldCharType="separate"/>
+      </w:r>
       <w:r>
         <w:rPr>
           <w:rFonts w:cs="Times New Roman"/>
         </w:rPr>
-        <w:t>Pirkis</w:t>
-      </w:r>
-      <w:proofErr w:type="spellEnd"/>
-      <w:r>
-        <w:rPr>
-          <w:rFonts w:cs="Times New Roman"/>
-        </w:rPr>
-        <w:t>, 2024; O’Connor et al., 2024)</w:t>
-      </w:r>
-      <w:r>
-        <w:rPr>
-          <w:rFonts w:cs="Calibri"/>
-        </w:rPr>
-        <w:fldChar w:fldCharType="end"/>
-      </w:r>
-      <w:r>
-        <w:rPr>
-          <w:rFonts w:cs="Calibri"/>
-        </w:rPr>
-        <w:t xml:space="preserve">. </w:t>
-      </w:r>
-      <w:r>
-        <w:rPr>
-          <w:rFonts w:cs="Calibri"/>
-        </w:rPr>
-        <w:t xml:space="preserve">Factors such as income level, unemployment, violence, social isolation, substance abuse, and discrimination thus exert a decisive influence on the development of suicide risk </w:t>
-      </w:r>
-      <w:r>
-        <w:rPr>
-          <w:rFonts w:cs="Calibri"/>
-        </w:rPr>
-        <w:fldChar w:fldCharType="begin"/>
-      </w:r>
-      <w:r>
-        <w:rPr>
-          <w:rFonts w:cs="Calibri"/>
-        </w:rPr>
-        <w:instrText xml:space="preserve"> ADDIN ZOTERO_ITEM CSL_CITATION {"citationID":"caymOgRh","properties":{"unsorted":false,"formattedCitation":"(Hawton &amp; Pirkis, 2024; O\\uc0\\u8217{}Connor et al., 2024; Pirkis et al., 2024)","plainCitation":"(Hawton &amp; Pirkis, 2024; O’Connor et al., 2024; Pirkis et al., 2024)","noteIndex":0},"citationItems":[{"id":4,"uris":["http://zotero.org/users/local/Q88HxZOk/items/MQEQQ4AS"],"itemData":{"id":4,"type":"article-journal","container-title":"The Lancet Public Health","DOI":"10.1016/S2468-2667(24)00159-2","ISSN":"24682667","issue":"10","journalAbbreviation":"The Lancet Public Health","language":"en","page":"e825-e830","source":"DOI.org (Crossref)","title":"Preventing suicide: a call to action","title-short":"Preventing suicide","volume":"9","author":[{"family":"Hawton","given":"Keith"},{"family":"Pirkis","given":"Jane"}],"issued":{"date-parts":[["2024",10]]}}},{"id":10,"uris":["http://zotero.org/users/local/Q88HxZOk/items/Y25DZ3CA"],"itemData":{"id":10,"type":"article-journal","container-title":"The Lancet Public Health","DOI":"10.1016/S2468-2667(24)00217-2","ISSN":"24682667","issue":"10","journalAbbreviation":"The Lancet Public Health","language":"en","page":"e714-e715","source":"DOI.org (Crossref)","title":"Preventing suicide: understanding the complex interplay between individual and societal factors","title-short":"Preventing suicide","volume":"9","author":[{"family":"O'Connor","given":"Rory C"},{"family":"Kirtley","given":"Olivia J"},{"family":"De Beurs","given":"Derek"}],"issued":{"date-parts":[["2024",10]]}}},{"id":12,"uris":["http://zotero.org/users/local/Q88HxZOk/items/BNZKK4FD"],"itemData":{"id":12,"type":"article-journal","container-title":"The Lancet Public Health","DOI":"10.1016/S2468-2667(24)00149-X","ISSN":"24682667","issue":"10","journalAbbreviation":"The Lancet Public Health","language":"en","page":"e787-e795","source":"DOI.org (Crossref)","title":"Preventing suicide: a public health approach to a global problem","title-short":"Preventing suicide","volume":"9","author":[{"family":"Pirkis","given":"Jane"},{"family":"Dandona","given":"Rakhi"},{"family":"Silverman","given":"Morton"},{"family":"Khan","given":"Murad"},{"family":"Hawton","given":"Keith"}],"issued":{"date-parts":[["2024",10]]}}}],"schema":"https://github.com/citation-style-language/schema/raw/master/csl-citation.json"} </w:instrText>
-      </w:r>
-      <w:r>
-        <w:rPr>
-          <w:rFonts w:cs="Calibri"/>
-        </w:rPr>
-        <w:fldChar w:fldCharType="separate"/>
-      </w:r>
-      <w:r>
-        <w:rPr>
-          <w:rFonts w:cs="Times New Roman"/>
-        </w:rPr>
-        <w:t xml:space="preserve">(Hawton &amp; </w:t>
-      </w:r>
-      <w:proofErr w:type="spellStart"/>
-      <w:r>
-        <w:rPr>
-          <w:rFonts w:cs="Times New Roman"/>
-        </w:rPr>
-        <w:t>Pirkis</w:t>
-      </w:r>
-      <w:proofErr w:type="spellEnd"/>
-      <w:r>
-        <w:rPr>
-          <w:rFonts w:cs="Times New Roman"/>
-        </w:rPr>
-        <w:t xml:space="preserve">, 2024; O’Connor et al., 2024; </w:t>
-      </w:r>
-      <w:proofErr w:type="spellStart"/>
-      <w:r>
-        <w:rPr>
-          <w:rFonts w:cs="Times New Roman"/>
-        </w:rPr>
-        <w:t>Pirkis</w:t>
-      </w:r>
-      <w:proofErr w:type="spellEnd"/>
-      <w:r>
-        <w:rPr>
-          <w:rFonts w:cs="Times New Roman"/>
-        </w:rPr>
-        <w:t xml:space="preserve"> et al., 2024)</w:t>
+        <w:t>(Hawton &amp; Pirkis, 2024; O’Connor et al., 2024; Pirkis et al., 2024)</w:t>
       </w:r>
       <w:r>
         <w:rPr>
@@ -7777,15 +7685,7 @@
         <w:fldChar w:fldCharType="separate"/>
       </w:r>
       <w:r>
-        <w:t>(</w:t>
-      </w:r>
-      <w:proofErr w:type="spellStart"/>
-      <w:r>
-        <w:t>Pirkis</w:t>
-      </w:r>
-      <w:proofErr w:type="spellEnd"/>
-      <w:r>
-        <w:t xml:space="preserve"> et al., 2024)</w:t>
+        <w:t>(Pirkis et al., 2024)</w:t>
       </w:r>
       <w:r>
         <w:rPr>
@@ -7929,31 +7829,7 @@
         <w:fldChar w:fldCharType="separate"/>
       </w:r>
       <w:r>
-        <w:t xml:space="preserve">(DeBeer et al., 2024; Hawton &amp; </w:t>
-      </w:r>
-      <w:proofErr w:type="spellStart"/>
-      <w:r>
-        <w:t>Pirkis</w:t>
-      </w:r>
-      <w:proofErr w:type="spellEnd"/>
-      <w:r>
-        <w:t xml:space="preserve">, 2024; Nadeem </w:t>
-      </w:r>
-      <w:proofErr w:type="spellStart"/>
-      <w:r>
-        <w:t>Parpio</w:t>
-      </w:r>
-      <w:proofErr w:type="spellEnd"/>
-      <w:r>
-        <w:t xml:space="preserve"> et al., 2025; </w:t>
-      </w:r>
-      <w:proofErr w:type="spellStart"/>
-      <w:r>
-        <w:t>Pirkis</w:t>
-      </w:r>
-      <w:proofErr w:type="spellEnd"/>
-      <w:r>
-        <w:t xml:space="preserve"> et al., 2024)</w:t>
+        <w:t>(DeBeer et al., 2024; Hawton &amp; Pirkis, 2024; Nadeem Parpio et al., 2025; Pirkis et al., 2024)</w:t>
       </w:r>
       <w:r>
         <w:rPr>
@@ -8001,31 +7877,7 @@
         <w:fldChar w:fldCharType="separate"/>
       </w:r>
       <w:r>
-        <w:t xml:space="preserve">(Hawton &amp; </w:t>
-      </w:r>
-      <w:proofErr w:type="spellStart"/>
-      <w:r>
-        <w:t>Pirkis</w:t>
-      </w:r>
-      <w:proofErr w:type="spellEnd"/>
-      <w:r>
-        <w:t xml:space="preserve">, 2024; Na et al., 2025; Nadeem </w:t>
-      </w:r>
-      <w:proofErr w:type="spellStart"/>
-      <w:r>
-        <w:t>Parpio</w:t>
-      </w:r>
-      <w:proofErr w:type="spellEnd"/>
-      <w:r>
-        <w:t xml:space="preserve"> et al., 2025; </w:t>
-      </w:r>
-      <w:proofErr w:type="spellStart"/>
-      <w:r>
-        <w:t>Pirkis</w:t>
-      </w:r>
-      <w:proofErr w:type="spellEnd"/>
-      <w:r>
-        <w:t xml:space="preserve"> et al., 2024)</w:t>
+        <w:t>(Hawton &amp; Pirkis, 2024; Na et al., 2025; Nadeem Parpio et al., 2025; Pirkis et al., 2024)</w:t>
       </w:r>
       <w:r>
         <w:rPr>
@@ -8123,21 +7975,7 @@
         <w:rPr>
           <w:rFonts w:cs="Times New Roman"/>
         </w:rPr>
-        <w:t>(</w:t>
-      </w:r>
-      <w:proofErr w:type="spellStart"/>
-      <w:r>
-        <w:rPr>
-          <w:rFonts w:cs="Times New Roman"/>
-        </w:rPr>
-        <w:t>Somé</w:t>
-      </w:r>
-      <w:proofErr w:type="spellEnd"/>
-      <w:r>
-        <w:rPr>
-          <w:rFonts w:cs="Times New Roman"/>
-        </w:rPr>
-        <w:t xml:space="preserve"> et al., 2024; Spittal et al., 2025)</w:t>
+        <w:t>(Somé et al., 2024; Spittal et al., 2025)</w:t>
       </w:r>
       <w:r>
         <w:rPr>
@@ -8185,31 +8023,7 @@
         <w:fldChar w:fldCharType="separate"/>
       </w:r>
       <w:r>
-        <w:t xml:space="preserve">(Biplob et al., 2023; </w:t>
-      </w:r>
-      <w:proofErr w:type="spellStart"/>
-      <w:r>
-        <w:t>Pranckeviciene</w:t>
-      </w:r>
-      <w:proofErr w:type="spellEnd"/>
-      <w:r>
-        <w:t xml:space="preserve"> &amp; </w:t>
-      </w:r>
-      <w:proofErr w:type="spellStart"/>
-      <w:r>
-        <w:t>Kasperiuniene</w:t>
-      </w:r>
-      <w:proofErr w:type="spellEnd"/>
-      <w:r>
-        <w:t xml:space="preserve">, 2024; </w:t>
-      </w:r>
-      <w:proofErr w:type="spellStart"/>
-      <w:r>
-        <w:t>Rotejanaprasert</w:t>
-      </w:r>
-      <w:proofErr w:type="spellEnd"/>
-      <w:r>
-        <w:t xml:space="preserve"> et al., 2025)</w:t>
+        <w:t>(Biplob et al., 2023; Pranckeviciene &amp; Kasperiuniene, 2024; Rotejanaprasert et al., 2025)</w:t>
       </w:r>
       <w:r>
         <w:rPr>
@@ -8494,18 +8308,12 @@
         <w:rPr>
           <w:rFonts w:cs="Calibri"/>
         </w:rPr>
-        <w:instrText xml:space="preserve"> REF _Ref234496967 \h </w:instrText>
-      </w:r>
-      <w:r>
-        <w:rPr>
-          <w:rFonts w:cs="Calibri"/>
-        </w:rPr>
-      </w:r>
-      <w:r>
-        <w:rPr>
-          <w:rFonts w:cs="Calibri"/>
-        </w:rPr>
-        <w:instrText xml:space="preserve"> \* MERGEFORMAT </w:instrText>
+        <w:instrText xml:space="preserve"> REF _Ref234496967 \h  \* MERGEFORMAT </w:instrText>
+      </w:r>
+      <w:r>
+        <w:rPr>
+          <w:rFonts w:cs="Calibri"/>
+        </w:rPr>
       </w:r>
       <w:r>
         <w:rPr>
@@ -8734,18 +8542,12 @@
         <w:rPr>
           <w:rFonts w:cs="Calibri"/>
         </w:rPr>
-        <w:instrText xml:space="preserve"> REF _Ref234489019 \h </w:instrText>
-      </w:r>
-      <w:r>
-        <w:rPr>
-          <w:rFonts w:cs="Calibri"/>
-        </w:rPr>
-      </w:r>
-      <w:r>
-        <w:rPr>
-          <w:rFonts w:cs="Calibri"/>
-        </w:rPr>
-        <w:instrText xml:space="preserve"> \* MERGEFORMAT </w:instrText>
+        <w:instrText xml:space="preserve"> REF _Ref234489019 \h  \* MERGEFORMAT </w:instrText>
+      </w:r>
+      <w:r>
+        <w:rPr>
+          <w:rFonts w:cs="Calibri"/>
+        </w:rPr>
       </w:r>
       <w:r>
         <w:rPr>
@@ -9172,23 +8974,7 @@
                 <w:sz w:val="16"/>
                 <w:szCs w:val="16"/>
               </w:rPr>
-              <w:t xml:space="preserve">Dependent </w:t>
-            </w:r>
-            <w:r>
-              <w:rPr>
-                <w:rFonts w:cs="Calibri"/>
-                <w:sz w:val="16"/>
-                <w:szCs w:val="16"/>
-              </w:rPr>
-              <w:t>indicator</w:t>
-            </w:r>
-            <w:r>
-              <w:rPr>
-                <w:rFonts w:cs="Calibri"/>
-                <w:sz w:val="16"/>
-                <w:szCs w:val="16"/>
-              </w:rPr>
-              <w:t xml:space="preserve"> of the predictive model</w:t>
+              <w:t>Dependent indicator of the predictive model</w:t>
             </w:r>
           </w:p>
         </w:tc>
@@ -10217,31 +10003,7 @@
         <w:rPr>
           <w:rFonts w:cs="Calibri"/>
         </w:rPr>
-        <w:t>The working environment used was a version-control repository (Git/GitHub), with a local Python virtual environment and V</w:t>
-      </w:r>
-      <w:r>
-        <w:rPr>
-          <w:rFonts w:cs="Calibri"/>
-        </w:rPr>
-        <w:t xml:space="preserve">isual </w:t>
-      </w:r>
-      <w:r>
-        <w:rPr>
-          <w:rFonts w:cs="Calibri"/>
-        </w:rPr>
-        <w:t>S</w:t>
-      </w:r>
-      <w:r>
-        <w:rPr>
-          <w:rFonts w:cs="Calibri"/>
-        </w:rPr>
-        <w:t>tudio</w:t>
-      </w:r>
-      <w:r>
-        <w:rPr>
-          <w:rFonts w:cs="Calibri"/>
-        </w:rPr>
-        <w:t xml:space="preserve"> Code as the editor. The choice of this environment was based on</w:t>
+        <w:t>The working environment used was a version-control repository (Git/GitHub), with a local Python virtual environment and Visual Studio Code as the editor. The choice of this environment was based on</w:t>
       </w:r>
       <w:r>
         <w:rPr>
@@ -10569,19 +10331,7 @@
         <w:rPr>
           <w:rFonts w:cs="Calibri"/>
         </w:rPr>
-        <w:t xml:space="preserve">Data acquisition was carried out using two main approaches: dynamic access through APIs and loading a local file format. This combination makes it possible, on the one hand, to ensure the pipeline's updatability and reproducibility in the case of APIs, and on the other, to incorporate specific datasets not available through </w:t>
-      </w:r>
-      <w:r>
-        <w:rPr>
-          <w:rFonts w:cs="Calibri"/>
-        </w:rPr>
-        <w:t>code</w:t>
-      </w:r>
-      <w:r>
-        <w:rPr>
-          <w:rFonts w:cs="Calibri"/>
-        </w:rPr>
-        <w:t xml:space="preserve"> access</w:t>
+        <w:t>Data acquisition was carried out using two main approaches: dynamic access through APIs and loading a local file format. This combination makes it possible, on the one hand, to ensure the pipeline's updatability and reproducibility in the case of APIs, and on the other, to incorporate specific datasets not available through code access</w:t>
       </w:r>
       <w:r>
         <w:rPr>
@@ -10824,19 +10574,7 @@
         <w:rPr>
           <w:rFonts w:cs="Calibri"/>
         </w:rPr>
-        <w:t>come</w:t>
-      </w:r>
-      <w:r>
-        <w:rPr>
-          <w:rFonts w:cs="Calibri"/>
-        </w:rPr>
-        <w:t>s</w:t>
-      </w:r>
-      <w:r>
-        <w:rPr>
-          <w:rFonts w:cs="Calibri"/>
-        </w:rPr>
-        <w:t xml:space="preserve"> from the Global Burden of Disease (GBD 2023) study by the Institute for Health Metrics and Evaluation (IHME). This data was obtained by downloading it in CSV format from the official IHME website</w:t>
+        <w:t>comes from the Global Burden of Disease (GBD 2023) study by the Institute for Health Metrics and Evaluation (IHME). This data was obtained by downloading it in CSV format from the official IHME website</w:t>
       </w:r>
       <w:r>
         <w:rPr>
@@ -11048,19 +10786,7 @@
         <w:rPr>
           <w:rFonts w:cs="Calibri"/>
         </w:rPr>
-        <w:t xml:space="preserve"> </w:t>
-      </w:r>
-      <w:r>
-        <w:rPr>
-          <w:rFonts w:cs="Calibri"/>
-        </w:rPr>
-        <w:t>function and</w:t>
-      </w:r>
-      <w:r>
-        <w:rPr>
-          <w:rFonts w:cs="Calibri"/>
-        </w:rPr>
-        <w:t xml:space="preserve"> incorporated into the environment as an additional DataFrame</w:t>
+        <w:t xml:space="preserve"> function and incorporated into the environment as an additional DataFrame</w:t>
       </w:r>
       <w:r>
         <w:rPr>
@@ -11831,6 +11557,9 @@
         </w:rPr>
       </w:pPr>
       <w:r>
+        <w:rPr>
+          <w:noProof/>
+        </w:rPr>
         <w:lastRenderedPageBreak/>
         <mc:AlternateContent>
           <mc:Choice Requires="wps">
@@ -12093,6 +11822,9 @@
         </mc:AlternateContent>
       </w:r>
       <w:r>
+        <w:rPr>
+          <w:noProof/>
+        </w:rPr>
         <w:drawing>
           <wp:anchor distT="0" distB="0" distL="114300" distR="114300" simplePos="0" relativeHeight="251646976" behindDoc="0" locked="0" layoutInCell="1" allowOverlap="1" wp14:anchorId="0120DB8A" wp14:editId="30C77266">
             <wp:simplePos x="0" y="0"/>
@@ -12536,15 +12268,7 @@
           <w:rFonts w:eastAsiaTheme="minorEastAsia"/>
           <w:lang w:val="en-GB"/>
         </w:rPr>
-        <w:t>P</w:t>
-      </w:r>
-      <w:r>
-        <w:rPr>
-          <w:rStyle w:val="CodeChar"/>
-          <w:rFonts w:eastAsiaTheme="minorEastAsia"/>
-          <w:lang w:val="en-GB"/>
-        </w:rPr>
-        <w:t>hysicians per 100,000 inhabitants</w:t>
+        <w:t>Physicians per 100,000 inhabitants</w:t>
       </w:r>
       <w:r>
         <w:rPr>
@@ -12986,6 +12710,9 @@
         </w:rPr>
       </w:pPr>
       <w:r>
+        <w:rPr>
+          <w:noProof/>
+        </w:rPr>
         <w:lastRenderedPageBreak/>
         <mc:AlternateContent>
           <mc:Choice Requires="wps">
@@ -13226,10 +12953,11 @@
       <w:r>
         <w:rPr>
           <w:rFonts w:eastAsia="Times New Roman" w:cs="Segoe UI"/>
+          <w:noProof/>
           <w:lang w:eastAsia="es-ES"/>
         </w:rPr>
         <w:drawing>
-          <wp:anchor distT="0" distB="0" distL="114300" distR="114300" simplePos="0" relativeHeight="251652096" behindDoc="0" locked="0" layoutInCell="1" allowOverlap="1" wp14:anchorId="674226EC" wp14:editId="2C716313">
+          <wp:anchor distT="0" distB="0" distL="114300" distR="114300" simplePos="0" relativeHeight="251652096" behindDoc="0" locked="0" layoutInCell="1" allowOverlap="1" wp14:anchorId="674226EC" wp14:editId="7943749B">
             <wp:simplePos x="0" y="0"/>
             <wp:positionH relativeFrom="column">
               <wp:posOffset>-3810</wp:posOffset>
@@ -13288,6 +13016,7 @@
       <w:r>
         <w:rPr>
           <w:rFonts w:eastAsia="Times New Roman" w:cs="Segoe UI"/>
+          <w:noProof/>
           <w:lang w:eastAsia="es-ES"/>
         </w:rPr>
         <mc:AlternateContent>
@@ -13463,10 +13192,11 @@
       <w:r>
         <w:rPr>
           <w:rFonts w:eastAsia="Times New Roman" w:cs="Segoe UI"/>
+          <w:noProof/>
           <w:lang w:eastAsia="es-ES"/>
         </w:rPr>
         <w:drawing>
-          <wp:anchor distT="0" distB="0" distL="114300" distR="114300" simplePos="0" relativeHeight="251754496" behindDoc="0" locked="0" layoutInCell="1" allowOverlap="1" wp14:anchorId="3F52CE45" wp14:editId="22B279EB">
+          <wp:anchor distT="0" distB="0" distL="114300" distR="114300" simplePos="0" relativeHeight="251754496" behindDoc="0" locked="0" layoutInCell="1" allowOverlap="1" wp14:anchorId="3F52CE45" wp14:editId="7A571166">
             <wp:simplePos x="0" y="0"/>
             <wp:positionH relativeFrom="column">
               <wp:posOffset>-3810</wp:posOffset>
@@ -13695,20 +13425,13 @@
           <w:rFonts w:eastAsia="Times New Roman" w:cs="Segoe UI"/>
           <w:lang w:eastAsia="es-ES"/>
         </w:rPr>
-        <w:instrText xml:space="preserve"> REF _Ref234512010 \h </w:instrText>
-      </w:r>
-      <w:r>
-        <w:rPr>
-          <w:rFonts w:eastAsia="Times New Roman" w:cs="Segoe UI"/>
-          <w:lang w:eastAsia="es-ES"/>
-        </w:rPr>
-      </w:r>
-      <w:r>
-        <w:rPr>
-          <w:rFonts w:eastAsia="Times New Roman" w:cs="Segoe UI"/>
-          <w:lang w:eastAsia="es-ES"/>
-        </w:rPr>
-        <w:instrText xml:space="preserve"> \* MERGEFORMAT </w:instrText>
+        <w:instrText xml:space="preserve"> REF _Ref234512010 \h  \* MERGEFORMAT </w:instrText>
+      </w:r>
+      <w:r>
+        <w:rPr>
+          <w:rFonts w:eastAsia="Times New Roman" w:cs="Segoe UI"/>
+          <w:lang w:eastAsia="es-ES"/>
+        </w:rPr>
       </w:r>
       <w:r>
         <w:rPr>
@@ -13718,13 +13441,7 @@
         <w:fldChar w:fldCharType="separate"/>
       </w:r>
       <w:r>
-        <w:t>Tabl</w:t>
-      </w:r>
-      <w:r>
-        <w:t>e</w:t>
-      </w:r>
-      <w:r>
-        <w:t xml:space="preserve"> 3.2</w:t>
+        <w:t>Table 3.2</w:t>
       </w:r>
       <w:r>
         <w:rPr>
@@ -15213,13 +14930,7 @@
         <w:rPr>
           <w:lang w:val="en-GB"/>
         </w:rPr>
-        <w:t xml:space="preserve">: </w:t>
-      </w:r>
-      <w:r>
-        <w:rPr>
-          <w:lang w:val="en-GB"/>
-        </w:rPr>
-        <w:t>Summary statistics of outlier detection based on IQR thresholds for selected variables, including counts, percentages, and boundary limits</w:t>
+        <w:t>: Summary statistics of outlier detection based on IQR thresholds for selected variables, including counts, percentages, and boundary limits</w:t>
       </w:r>
     </w:p>
     <w:p>
@@ -15405,6 +15116,9 @@
         </w:rPr>
       </w:pPr>
       <w:r>
+        <w:rPr>
+          <w:noProof/>
+        </w:rPr>
         <w:lastRenderedPageBreak/>
         <w:drawing>
           <wp:anchor distT="0" distB="0" distL="114300" distR="114300" simplePos="0" relativeHeight="251653120" behindDoc="0" locked="0" layoutInCell="1" allowOverlap="1" wp14:anchorId="1168438C" wp14:editId="14F2A459">
@@ -15464,6 +15178,9 @@
         </w:drawing>
       </w:r>
       <w:r>
+        <w:rPr>
+          <w:noProof/>
+        </w:rPr>
         <mc:AlternateContent>
           <mc:Choice Requires="wps">
             <w:drawing>
@@ -15588,13 +15305,7 @@
                               <w:rPr>
                                 <w:lang w:val="en-GB"/>
                               </w:rPr>
-                              <w:t xml:space="preserve">: </w:t>
-                            </w:r>
-                            <w:r>
-                              <w:rPr>
-                                <w:lang w:val="en-GB"/>
-                              </w:rPr>
-                              <w:t>Country-level distribution of suicide rates (per 100,000 inhabitants) as part of the outlier analysis, illustrating variability and potential extreme observations across EU countries (2000–2021).</w:t>
+                              <w:t>: Country-level distribution of suicide rates (per 100,000 inhabitants) as part of the outlier analysis, illustrating variability and potential extreme observations across EU countries (2000–2021).</w:t>
                             </w:r>
                           </w:p>
                         </w:txbxContent>
@@ -15703,13 +15414,7 @@
                         <w:rPr>
                           <w:lang w:val="en-GB"/>
                         </w:rPr>
-                        <w:t xml:space="preserve">: </w:t>
-                      </w:r>
-                      <w:r>
-                        <w:rPr>
-                          <w:lang w:val="en-GB"/>
-                        </w:rPr>
-                        <w:t>Country-level distribution of suicide rates (per 100,000 inhabitants) as part of the outlier analysis, illustrating variability and potential extreme observations across EU countries (2000–2021).</w:t>
+                        <w:t>: Country-level distribution of suicide rates (per 100,000 inhabitants) as part of the outlier analysis, illustrating variability and potential extreme observations across EU countries (2000–2021).</w:t>
                       </w:r>
                     </w:p>
                   </w:txbxContent>
@@ -15725,14 +15430,7 @@
           <w:rFonts w:eastAsia="Times New Roman" w:cs="Segoe UI"/>
           <w:lang w:eastAsia="es-ES"/>
         </w:rPr>
-        <w:t>To put these results in context, the dispersion of the suicide rate by country is represented</w:t>
-      </w:r>
-      <w:r>
-        <w:rPr>
-          <w:rFonts w:eastAsia="Times New Roman" w:cs="Segoe UI"/>
-          <w:lang w:eastAsia="es-ES"/>
-        </w:rPr>
-        <w:t xml:space="preserve"> </w:t>
+        <w:t xml:space="preserve">To put these results in context, the dispersion of the suicide rate by country is represented </w:t>
       </w:r>
       <w:r>
         <w:rPr>
@@ -15760,13 +15458,13 @@
           <w:rFonts w:eastAsia="Times New Roman" w:cs="Segoe UI"/>
           <w:lang w:eastAsia="es-ES"/>
         </w:rPr>
-      </w:r>
-      <w:r>
-        <w:rPr>
-          <w:rFonts w:eastAsia="Times New Roman" w:cs="Segoe UI"/>
-          <w:lang w:eastAsia="es-ES"/>
-        </w:rPr>
         <w:instrText xml:space="preserve"> \* MERGEFORMAT </w:instrText>
+      </w:r>
+      <w:r>
+        <w:rPr>
+          <w:rFonts w:eastAsia="Times New Roman" w:cs="Segoe UI"/>
+          <w:lang w:eastAsia="es-ES"/>
+        </w:rPr>
       </w:r>
       <w:r>
         <w:rPr>
@@ -15895,14 +15593,7 @@
           <w:rFonts w:eastAsia="Times New Roman" w:cs="Segoe UI"/>
           <w:lang w:eastAsia="es-ES"/>
         </w:rPr>
-        <w:t>Three</w:t>
-      </w:r>
-      <w:r>
-        <w:rPr>
-          <w:rFonts w:eastAsia="Times New Roman" w:cs="Segoe UI"/>
-          <w:lang w:eastAsia="es-ES"/>
-        </w:rPr>
-        <w:t xml:space="preserve"> countries representative of the distribution identified in the previous section are selected</w:t>
+        <w:t>Three countries representative of the distribution identified in the previous section are selected</w:t>
       </w:r>
       <w:r>
         <w:rPr>
@@ -16115,20 +15806,13 @@
           <w:rFonts w:eastAsia="Times New Roman" w:cs="Segoe UI"/>
           <w:lang w:eastAsia="es-ES"/>
         </w:rPr>
-        <w:instrText xml:space="preserve"> REF _Ref234492058 \h </w:instrText>
-      </w:r>
-      <w:r>
-        <w:rPr>
-          <w:rFonts w:eastAsia="Times New Roman" w:cs="Segoe UI"/>
-          <w:lang w:eastAsia="es-ES"/>
-        </w:rPr>
-      </w:r>
-      <w:r>
-        <w:rPr>
-          <w:rFonts w:eastAsia="Times New Roman" w:cs="Segoe UI"/>
-          <w:lang w:eastAsia="es-ES"/>
-        </w:rPr>
-        <w:instrText xml:space="preserve"> \* MERGEFORMAT </w:instrText>
+        <w:instrText xml:space="preserve"> REF _Ref234492058 \h  \* MERGEFORMAT </w:instrText>
+      </w:r>
+      <w:r>
+        <w:rPr>
+          <w:rFonts w:eastAsia="Times New Roman" w:cs="Segoe UI"/>
+          <w:lang w:eastAsia="es-ES"/>
+        </w:rPr>
       </w:r>
       <w:r>
         <w:rPr>
@@ -16138,13 +15822,7 @@
         <w:fldChar w:fldCharType="separate"/>
       </w:r>
       <w:r>
-        <w:t>Figu</w:t>
-      </w:r>
-      <w:r>
-        <w:t>r</w:t>
-      </w:r>
-      <w:r>
-        <w:t>e 3.4</w:t>
+        <w:t>Figure 3.4</w:t>
       </w:r>
       <w:r>
         <w:rPr>
@@ -16175,6 +15853,9 @@
         <w:t xml:space="preserve">In simplified terms, the function's logic is based on iterating over the </w:t>
       </w:r>
       <w:r>
+        <w:rPr>
+          <w:noProof/>
+        </w:rPr>
         <w:lastRenderedPageBreak/>
         <mc:AlternateContent>
           <mc:Choice Requires="wps">
@@ -16300,13 +15981,7 @@
                               <w:rPr>
                                 <w:lang w:val="en-GB"/>
                               </w:rPr>
-                              <w:t xml:space="preserve">: </w:t>
-                            </w:r>
-                            <w:r>
-                              <w:rPr>
-                                <w:lang w:val="en-GB"/>
-                              </w:rPr>
-                              <w:t>Temporal evolution of suicide rates (per 100,000 inhabitants) in selected EU countries (Lithuania, Greece, and Germany) over the period 2000–2021, illustrating contrasting trends and levels across high-, low-, and mid-range contexts.</w:t>
+                              <w:t>: Temporal evolution of suicide rates (per 100,000 inhabitants) in selected EU countries (Lithuania, Greece, and Germany) over the period 2000–2021, illustrating contrasting trends and levels across high-, low-, and mid-range contexts.</w:t>
                             </w:r>
                             <w:bookmarkEnd w:id="35"/>
                           </w:p>
@@ -16419,13 +16094,7 @@
                         <w:rPr>
                           <w:lang w:val="en-GB"/>
                         </w:rPr>
-                        <w:t xml:space="preserve">: </w:t>
-                      </w:r>
-                      <w:r>
-                        <w:rPr>
-                          <w:lang w:val="en-GB"/>
-                        </w:rPr>
-                        <w:t>Temporal evolution of suicide rates (per 100,000 inhabitants) in selected EU countries (Lithuania, Greece, and Germany) over the period 2000–2021, illustrating contrasting trends and levels across high-, low-, and mid-range contexts.</w:t>
+                        <w:t>: Temporal evolution of suicide rates (per 100,000 inhabitants) in selected EU countries (Lithuania, Greece, and Germany) over the period 2000–2021, illustrating contrasting trends and levels across high-, low-, and mid-range contexts.</w:t>
                       </w:r>
                       <w:bookmarkEnd w:id="36"/>
                     </w:p>
@@ -16438,6 +16107,9 @@
         </mc:AlternateContent>
       </w:r>
       <w:r>
+        <w:rPr>
+          <w:noProof/>
+        </w:rPr>
         <mc:AlternateContent>
           <mc:Choice Requires="wpg">
             <w:drawing>
@@ -16704,35 +16376,7 @@
           <w:rFonts w:eastAsia="Times New Roman" w:cs="Segoe UI"/>
           <w:lang w:eastAsia="es-ES"/>
         </w:rPr>
-        <w:t>Figur</w:t>
-      </w:r>
-      <w:r>
-        <w:rPr>
-          <w:rFonts w:eastAsia="Times New Roman" w:cs="Segoe UI"/>
-          <w:lang w:eastAsia="es-ES"/>
-        </w:rPr>
-        <w:t>e</w:t>
-      </w:r>
-      <w:r>
-        <w:rPr>
-          <w:rFonts w:eastAsia="Times New Roman" w:cs="Segoe UI"/>
-          <w:lang w:eastAsia="es-ES"/>
-        </w:rPr>
-        <w:t xml:space="preserve"> </w:t>
-      </w:r>
-      <w:r>
-        <w:rPr>
-          <w:rFonts w:eastAsia="Times New Roman" w:cs="Segoe UI"/>
-          <w:lang w:eastAsia="es-ES"/>
-        </w:rPr>
-        <w:t>3</w:t>
-      </w:r>
-      <w:r>
-        <w:rPr>
-          <w:rFonts w:eastAsia="Times New Roman" w:cs="Segoe UI"/>
-          <w:lang w:eastAsia="es-ES"/>
-        </w:rPr>
-        <w:t>.5</w:t>
+        <w:t>Figure 3.5</w:t>
       </w:r>
       <w:r>
         <w:rPr>
@@ -16746,21 +16390,7 @@
           <w:rFonts w:eastAsia="Times New Roman" w:cs="Segoe UI"/>
           <w:lang w:eastAsia="es-ES"/>
         </w:rPr>
-        <w:t xml:space="preserve">). This assumption is empirically tested </w:t>
-      </w:r>
-      <w:r>
-        <w:rPr>
-          <w:rFonts w:eastAsia="Times New Roman" w:cs="Segoe UI"/>
-          <w:lang w:eastAsia="es-ES"/>
-        </w:rPr>
-        <w:t>later</w:t>
-      </w:r>
-      <w:r>
-        <w:rPr>
-          <w:rFonts w:eastAsia="Times New Roman" w:cs="Segoe UI"/>
-          <w:lang w:eastAsia="es-ES"/>
-        </w:rPr>
-        <w:t>, in the Unsupervised Modelling section (</w:t>
+        <w:t>). This assumption is empirically tested later, in the Unsupervised Modelling section (</w:t>
       </w:r>
       <w:r>
         <w:rPr>
@@ -16831,6 +16461,9 @@
         </w:rPr>
       </w:pPr>
       <w:r>
+        <w:rPr>
+          <w:noProof/>
+        </w:rPr>
         <w:lastRenderedPageBreak/>
         <mc:AlternateContent>
           <mc:Choice Requires="wps">
@@ -16956,13 +16589,7 @@
                               <w:rPr>
                                 <w:lang w:val="en-GB"/>
                               </w:rPr>
-                              <w:t xml:space="preserve">: </w:t>
-                            </w:r>
-                            <w:r>
-                              <w:rPr>
-                                <w:lang w:val="en-GB"/>
-                              </w:rPr>
-                              <w:t>Temporal evolution of suicide rates (per 100,000 inhabitants) in EU Regions (over the period 2000–2021), showing marked regional disparities and a general downward trajectory over time.</w:t>
+                              <w:t>: Temporal evolution of suicide rates (per 100,000 inhabitants) in EU Regions (over the period 2000–2021), showing marked regional disparities and a general downward trajectory over time.</w:t>
                             </w:r>
                           </w:p>
                         </w:txbxContent>
@@ -17071,13 +16698,7 @@
                         <w:rPr>
                           <w:lang w:val="en-GB"/>
                         </w:rPr>
-                        <w:t xml:space="preserve">: </w:t>
-                      </w:r>
-                      <w:r>
-                        <w:rPr>
-                          <w:lang w:val="en-GB"/>
-                        </w:rPr>
-                        <w:t>Temporal evolution of suicide rates (per 100,000 inhabitants) in EU Regions (over the period 2000–2021), showing marked regional disparities and a general downward trajectory over time.</w:t>
+                        <w:t>: Temporal evolution of suicide rates (per 100,000 inhabitants) in EU Regions (over the period 2000–2021), showing marked regional disparities and a general downward trajectory over time.</w:t>
                       </w:r>
                     </w:p>
                   </w:txbxContent>
@@ -17089,8 +16710,11 @@
         </mc:AlternateContent>
       </w:r>
       <w:r>
+        <w:rPr>
+          <w:noProof/>
+        </w:rPr>
         <w:drawing>
-          <wp:anchor distT="0" distB="0" distL="114300" distR="114300" simplePos="0" relativeHeight="251664384" behindDoc="0" locked="0" layoutInCell="1" allowOverlap="1" wp14:anchorId="3D90553B" wp14:editId="46A150ED">
+          <wp:anchor distT="0" distB="0" distL="114300" distR="114300" simplePos="0" relativeHeight="251664384" behindDoc="0" locked="0" layoutInCell="1" allowOverlap="1" wp14:anchorId="3D90553B" wp14:editId="3CCF5E07">
             <wp:simplePos x="0" y="0"/>
             <wp:positionH relativeFrom="column">
               <wp:posOffset>5715</wp:posOffset>
@@ -17151,14 +16775,7 @@
           <w:rFonts w:eastAsia="Times New Roman" w:cs="Segoe UI"/>
           <w:lang w:eastAsia="es-ES"/>
         </w:rPr>
-        <w:t xml:space="preserve"> </w:t>
-      </w:r>
-      <w:r>
-        <w:rPr>
-          <w:rFonts w:eastAsia="Times New Roman" w:cs="Segoe UI"/>
-          <w:lang w:eastAsia="es-ES"/>
-        </w:rPr>
-        <w:t xml:space="preserve">In this context, data aggregation is performed implicitly through the function </w:t>
+        <w:t xml:space="preserve"> In this context, data aggregation is performed implicitly through the function </w:t>
       </w:r>
       <w:proofErr w:type="spellStart"/>
       <w:r>
@@ -17298,21 +16915,7 @@
           <w:lang w:eastAsia="es-ES"/>
         </w:rPr>
         <w:lastRenderedPageBreak/>
-        <w:t xml:space="preserve">variable, non-null values are </w:t>
-      </w:r>
-      <w:r>
-        <w:rPr>
-          <w:rFonts w:eastAsia="Times New Roman" w:cs="Segoe UI"/>
-          <w:lang w:eastAsia="es-ES"/>
-        </w:rPr>
-        <w:t>extracted,</w:t>
-      </w:r>
-      <w:r>
-        <w:rPr>
-          <w:rFonts w:eastAsia="Times New Roman" w:cs="Segoe UI"/>
-          <w:lang w:eastAsia="es-ES"/>
-        </w:rPr>
-        <w:t xml:space="preserve"> and their distribution is represented through histograms accompanied by kernel density estimates (KDE), which approximate each variable's probability density function.</w:t>
+        <w:t>variable, non-null values are extracted, and their distribution is represented through histograms accompanied by kernel density estimates (KDE), which approximate each variable's probability density function.</w:t>
       </w:r>
     </w:p>
     <w:p>
@@ -17363,6 +16966,7 @@
           <w:color w:val="FF0000"/>
           <w:lang w:eastAsia="es-ES"/>
         </w:rPr>
+        <w:instrText xml:space="preserve"> \* MERGEFORMAT </w:instrText>
       </w:r>
       <w:r>
         <w:rPr>
@@ -17372,7 +16976,6 @@
           <w:color w:val="FF0000"/>
           <w:lang w:eastAsia="es-ES"/>
         </w:rPr>
-        <w:instrText xml:space="preserve"> \* MERGEFORMAT </w:instrText>
       </w:r>
       <w:r>
         <w:rPr>
@@ -17574,10 +17177,14 @@
         <w:pStyle w:val="Heading3"/>
       </w:pPr>
       <w:bookmarkStart w:id="41" w:name="_Toc234525108"/>
+      <w:bookmarkStart w:id="42" w:name="_Ref234907074"/>
+      <w:bookmarkStart w:id="43" w:name="_Ref234907081"/>
       <w:r>
         <w:t>Multicollinearity and variable selection</w:t>
       </w:r>
       <w:bookmarkEnd w:id="41"/>
+      <w:bookmarkEnd w:id="42"/>
+      <w:bookmarkEnd w:id="43"/>
     </w:p>
     <w:p>
       <w:pPr>
@@ -17681,21 +17288,7 @@
           <w:rFonts w:eastAsia="Times New Roman" w:cs="Segoe UI"/>
           <w:lang w:eastAsia="es-ES"/>
         </w:rPr>
-        <w:t xml:space="preserve"> library is used, applying the calculation to the dataset </w:t>
-      </w:r>
-      <w:r>
-        <w:rPr>
-          <w:rFonts w:eastAsia="Times New Roman" w:cs="Segoe UI"/>
-          <w:lang w:eastAsia="es-ES"/>
-        </w:rPr>
-        <w:t>to</w:t>
-      </w:r>
-      <w:r>
-        <w:rPr>
-          <w:rFonts w:eastAsia="Times New Roman" w:cs="Segoe UI"/>
-          <w:lang w:eastAsia="es-ES"/>
-        </w:rPr>
-        <w:t xml:space="preserve"> compute the VIF for the entire set of explanatory variables.</w:t>
+        <w:t xml:space="preserve"> library is used, applying the calculation to the dataset to compute the VIF for the entire set of explanatory variables.</w:t>
       </w:r>
     </w:p>
     <w:p>
@@ -17713,14 +17306,7 @@
           <w:lang w:eastAsia="es-ES"/>
         </w:rPr>
         <w:lastRenderedPageBreak/>
-        <w:t>The resulting values are sorted in descending order by VIF, making it possible to identify the variables with the highest degree of multicollinearity. Following common criteria, values above 5 are considered indicative of moderate multicollinearity. The conventional threshold of VIF &gt; 10 is adopted</w:t>
-      </w:r>
-      <w:r>
-        <w:rPr>
-          <w:rFonts w:eastAsia="Times New Roman" w:cs="Segoe UI"/>
-          <w:lang w:eastAsia="es-ES"/>
-        </w:rPr>
-        <w:t xml:space="preserve"> </w:t>
+        <w:t xml:space="preserve">The resulting values are sorted in descending order by VIF, making it possible to identify the variables with the highest degree of multicollinearity. Following common criteria, values above 5 are considered indicative of moderate multicollinearity. The conventional threshold of VIF &gt; 10 is adopted </w:t>
       </w:r>
       <w:r>
         <w:rPr>
@@ -17785,12 +17371,13 @@
       <w:r>
         <w:rPr>
           <w:rFonts w:eastAsia="Times New Roman" w:cs="Segoe UI"/>
+          <w:noProof/>
           <w:lang w:eastAsia="es-ES"/>
         </w:rPr>
         <mc:AlternateContent>
           <mc:Choice Requires="wpg">
             <w:drawing>
-              <wp:anchor distT="0" distB="0" distL="114300" distR="114300" simplePos="0" relativeHeight="251723776" behindDoc="0" locked="0" layoutInCell="1" allowOverlap="1" wp14:anchorId="7220D101" wp14:editId="2DBA01E2">
+              <wp:anchor distT="0" distB="0" distL="114300" distR="114300" simplePos="0" relativeHeight="251723776" behindDoc="0" locked="0" layoutInCell="1" allowOverlap="1" wp14:anchorId="7220D101" wp14:editId="264B963D">
                 <wp:simplePos x="0" y="0"/>
                 <wp:positionH relativeFrom="column">
                   <wp:posOffset>2101215</wp:posOffset>
@@ -17877,7 +17464,7 @@
                                   <w:lang w:val="en-GB"/>
                                 </w:rPr>
                               </w:pPr>
-                              <w:bookmarkStart w:id="42" w:name="_Ref234325524"/>
+                              <w:bookmarkStart w:id="44" w:name="_Ref234325524"/>
                               <w:r>
                                 <w:rPr>
                                   <w:lang w:val="en-GB"/>
@@ -17950,18 +17537,12 @@
                                 </w:rPr>
                                 <w:fldChar w:fldCharType="end"/>
                               </w:r>
-                              <w:bookmarkEnd w:id="42"/>
+                              <w:bookmarkEnd w:id="44"/>
                               <w:r>
                                 <w:rPr>
                                   <w:lang w:val="en-GB"/>
                                 </w:rPr>
-                                <w:t xml:space="preserve">: </w:t>
-                              </w:r>
-                              <w:r>
-                                <w:rPr>
-                                  <w:lang w:val="en-GB"/>
-                                </w:rPr>
-                                <w:t xml:space="preserve">Preliminary multicollinearity assessment using Variance Inflation Factor (VIF). The </w:t>
+                                <w:t xml:space="preserve">: Preliminary multicollinearity assessment using Variance Inflation Factor (VIF). The </w:t>
                               </w:r>
                               <w:r>
                                 <w:rPr>
@@ -18024,6 +17605,25 @@
           <mc:Fallback>
             <w:pict>
               <v:group w14:anchorId="7220D101" id="Group 15" o:spid="_x0000_s1035" style="position:absolute;left:0;text-align:left;margin-left:165.45pt;margin-top:14.65pt;width:300.25pt;height:218pt;z-index:251723776;mso-width-relative:margin;mso-height-relative:margin" coordsize="40481,29959" o:gfxdata="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">
+                <v:shapetype id="_x0000_t75" coordsize="21600,21600" o:spt="75" o:preferrelative="t" path="m@4@5l@4@11@9@11@9@5xe" filled="f" stroked="f">
+                  <v:stroke joinstyle="miter"/>
+                  <v:formulas>
+                    <v:f eqn="if lineDrawn pixelLineWidth 0"/>
+                    <v:f eqn="sum @0 1 0"/>
+                    <v:f eqn="sum 0 0 @1"/>
+                    <v:f eqn="prod @2 1 2"/>
+                    <v:f eqn="prod @3 21600 pixelWidth"/>
+                    <v:f eqn="prod @3 21600 pixelHeight"/>
+                    <v:f eqn="sum @0 0 1"/>
+                    <v:f eqn="prod @6 1 2"/>
+                    <v:f eqn="prod @7 21600 pixelWidth"/>
+                    <v:f eqn="sum @8 21600 0"/>
+                    <v:f eqn="prod @7 21600 pixelHeight"/>
+                    <v:f eqn="sum @10 21600 0"/>
+                  </v:formulas>
+                  <v:path o:extrusionok="f" gradientshapeok="t" o:connecttype="rect"/>
+                  <o:lock v:ext="edit" aspectratio="t"/>
+                </v:shapetype>
                 <v:shape id="Imagen 11" o:spid="_x0000_s1036" type="#_x0000_t75" style="position:absolute;width:40481;height:25120;visibility:visible;mso-wrap-style:square" o:gfxdata="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">
                   <v:imagedata r:id="rId26" o:title=""/>
                 </v:shape>
@@ -18038,7 +17638,7 @@
                             <w:lang w:val="en-GB"/>
                           </w:rPr>
                         </w:pPr>
-                        <w:bookmarkStart w:id="43" w:name="_Ref234325524"/>
+                        <w:bookmarkStart w:id="45" w:name="_Ref234325524"/>
                         <w:r>
                           <w:rPr>
                             <w:lang w:val="en-GB"/>
@@ -18111,18 +17711,12 @@
                           </w:rPr>
                           <w:fldChar w:fldCharType="end"/>
                         </w:r>
-                        <w:bookmarkEnd w:id="43"/>
+                        <w:bookmarkEnd w:id="45"/>
                         <w:r>
                           <w:rPr>
                             <w:lang w:val="en-GB"/>
                           </w:rPr>
-                          <w:t xml:space="preserve">: </w:t>
-                        </w:r>
-                        <w:r>
-                          <w:rPr>
-                            <w:lang w:val="en-GB"/>
-                          </w:rPr>
-                          <w:t xml:space="preserve">Preliminary multicollinearity assessment using Variance Inflation Factor (VIF). The </w:t>
+                          <w:t xml:space="preserve">: Preliminary multicollinearity assessment using Variance Inflation Factor (VIF). The </w:t>
                         </w:r>
                         <w:r>
                           <w:rPr>
@@ -18271,6 +17865,7 @@
           <w:color w:val="C00000"/>
           <w:lang w:eastAsia="es-ES"/>
         </w:rPr>
+        <w:instrText xml:space="preserve"> \* MERGEFORMAT </w:instrText>
       </w:r>
       <w:r>
         <w:rPr>
@@ -18280,7 +17875,6 @@
           <w:color w:val="C00000"/>
           <w:lang w:eastAsia="es-ES"/>
         </w:rPr>
-        <w:instrText xml:space="preserve"> \* MERGEFORMAT </w:instrText>
       </w:r>
       <w:r>
         <w:rPr>
@@ -18293,13 +17887,7 @@
         <w:fldChar w:fldCharType="separate"/>
       </w:r>
       <w:r>
-        <w:t>Figure</w:t>
-      </w:r>
-      <w:r>
-        <w:t xml:space="preserve"> </w:t>
-      </w:r>
-      <w:r>
-        <w:t>3.6</w:t>
+        <w:t>Figure 3.6</w:t>
       </w:r>
       <w:r>
         <w:rPr>
@@ -18385,6 +17973,7 @@
       <w:r>
         <w:rPr>
           <w:rFonts w:eastAsia="Times New Roman" w:cs="Segoe UI"/>
+          <w:noProof/>
           <w:lang w:eastAsia="es-ES"/>
         </w:rPr>
         <w:lastRenderedPageBreak/>
@@ -18480,7 +18069,7 @@
                                   <w:lang w:val="en-GB" w:eastAsia="es-ES"/>
                                 </w:rPr>
                               </w:pPr>
-                              <w:bookmarkStart w:id="44" w:name="_Ref234325650"/>
+                              <w:bookmarkStart w:id="46" w:name="_Ref234325650"/>
                               <w:r>
                                 <w:rPr>
                                   <w:lang w:val="en-GB"/>
@@ -18553,18 +18142,12 @@
                                 </w:rPr>
                                 <w:fldChar w:fldCharType="end"/>
                               </w:r>
-                              <w:bookmarkEnd w:id="44"/>
+                              <w:bookmarkEnd w:id="46"/>
                               <w:r>
                                 <w:rPr>
                                   <w:lang w:val="en-GB"/>
                                 </w:rPr>
-                                <w:t xml:space="preserve">: </w:t>
-                              </w:r>
-                              <w:r>
-                                <w:rPr>
-                                  <w:lang w:val="en-GB"/>
-                                </w:rPr>
-                                <w:t xml:space="preserve">Final multicollinearity assessment using the Variance Inflation Factor (VIF). Following the removal of the </w:t>
+                                <w:t xml:space="preserve">: Final multicollinearity assessment using the Variance Inflation Factor (VIF). Following the removal of the </w:t>
                               </w:r>
                               <w:r>
                                 <w:rPr>
@@ -18623,7 +18206,7 @@
                             <w:lang w:val="en-GB" w:eastAsia="es-ES"/>
                           </w:rPr>
                         </w:pPr>
-                        <w:bookmarkStart w:id="45" w:name="_Ref234325650"/>
+                        <w:bookmarkStart w:id="47" w:name="_Ref234325650"/>
                         <w:r>
                           <w:rPr>
                             <w:lang w:val="en-GB"/>
@@ -18696,18 +18279,12 @@
                           </w:rPr>
                           <w:fldChar w:fldCharType="end"/>
                         </w:r>
-                        <w:bookmarkEnd w:id="45"/>
+                        <w:bookmarkEnd w:id="47"/>
                         <w:r>
                           <w:rPr>
                             <w:lang w:val="en-GB"/>
                           </w:rPr>
-                          <w:t xml:space="preserve">: </w:t>
-                        </w:r>
-                        <w:r>
-                          <w:rPr>
-                            <w:lang w:val="en-GB"/>
-                          </w:rPr>
-                          <w:t xml:space="preserve">Final multicollinearity assessment using the Variance Inflation Factor (VIF). Following the removal of the </w:t>
+                          <w:t xml:space="preserve">: Final multicollinearity assessment using the Variance Inflation Factor (VIF). Following the removal of the </w:t>
                         </w:r>
                         <w:r>
                           <w:rPr>
@@ -18740,21 +18317,7 @@
           <w:rFonts w:eastAsia="Times New Roman" w:cs="Segoe UI"/>
           <w:lang w:eastAsia="es-ES"/>
         </w:rPr>
-        <w:t xml:space="preserve"> </w:t>
-      </w:r>
-      <w:r>
-        <w:rPr>
-          <w:rFonts w:eastAsia="Times New Roman" w:cs="Segoe UI"/>
-          <w:lang w:eastAsia="es-ES"/>
-        </w:rPr>
-        <w:t>After this refinement, the set of explanatory variables is free of significant multicollinearity issues</w:t>
-      </w:r>
-      <w:r>
-        <w:rPr>
-          <w:rFonts w:eastAsia="Times New Roman" w:cs="Segoe UI"/>
-          <w:lang w:eastAsia="es-ES"/>
-        </w:rPr>
-        <w:t xml:space="preserve"> </w:t>
+        <w:t xml:space="preserve"> After this refinement, the set of explanatory variables is free of significant multicollinearity issues </w:t>
       </w:r>
       <w:r>
         <w:rPr>
@@ -18786,6 +18349,7 @@
           <w:bCs/>
           <w:lang w:eastAsia="es-ES"/>
         </w:rPr>
+        <w:instrText xml:space="preserve"> \* MERGEFORMAT </w:instrText>
       </w:r>
       <w:r>
         <w:rPr>
@@ -18794,7 +18358,6 @@
           <w:bCs/>
           <w:lang w:eastAsia="es-ES"/>
         </w:rPr>
-        <w:instrText xml:space="preserve"> \* MERGEFORMAT </w:instrText>
       </w:r>
       <w:r>
         <w:rPr>
@@ -18914,14 +18477,14 @@
       <w:pPr>
         <w:pStyle w:val="Heading2"/>
       </w:pPr>
-      <w:bookmarkStart w:id="46" w:name="_Toc234525109"/>
+      <w:bookmarkStart w:id="48" w:name="_Toc234525109"/>
       <w:r>
         <w:t>D</w:t>
       </w:r>
       <w:r>
         <w:t>ata preparation for modelling</w:t>
       </w:r>
-      <w:bookmarkEnd w:id="46"/>
+      <w:bookmarkEnd w:id="48"/>
     </w:p>
     <w:p>
       <w:pPr>
@@ -19008,21 +18571,7 @@
           <w:rFonts w:eastAsia="Times New Roman" w:cs="Segoe UI"/>
           <w:lang w:eastAsia="es-ES"/>
         </w:rPr>
-        <w:t xml:space="preserve">a temporal split is considered, </w:t>
-      </w:r>
-      <w:r>
-        <w:rPr>
-          <w:rFonts w:eastAsia="Times New Roman" w:cs="Segoe UI"/>
-          <w:lang w:eastAsia="es-ES"/>
-        </w:rPr>
-        <w:t>to</w:t>
-      </w:r>
-      <w:r>
-        <w:rPr>
-          <w:rFonts w:eastAsia="Times New Roman" w:cs="Segoe UI"/>
-          <w:lang w:eastAsia="es-ES"/>
-        </w:rPr>
-        <w:t xml:space="preserve"> predict the evolution of the suicide rate in subsequent years. This approach is oriented towards capturing temporal patterns and evaluating predictive capability in future scenarios.</w:t>
+        <w:t>a temporal split is considered, to predict the evolution of the suicide rate in subsequent years. This approach is oriented towards capturing temporal patterns and evaluating predictive capability in future scenarios.</w:t>
       </w:r>
     </w:p>
     <w:p>
@@ -19054,11 +18603,11 @@
       <w:pPr>
         <w:pStyle w:val="Heading3"/>
       </w:pPr>
-      <w:bookmarkStart w:id="47" w:name="_Toc234525110"/>
+      <w:bookmarkStart w:id="49" w:name="_Toc234525110"/>
       <w:r>
         <w:t>Option A: geographical split</w:t>
       </w:r>
-      <w:bookmarkEnd w:id="47"/>
+      <w:bookmarkEnd w:id="49"/>
     </w:p>
     <w:p>
       <w:pPr>
@@ -19343,8 +18892,8 @@
         </w:rPr>
         <w:t>.</w:t>
       </w:r>
-      <w:bookmarkStart w:id="48" w:name="_Toc234511672"/>
-      <w:bookmarkEnd w:id="48"/>
+      <w:bookmarkStart w:id="50" w:name="_Toc234511672"/>
+      <w:bookmarkEnd w:id="50"/>
     </w:p>
     <w:p>
       <w:pPr>
@@ -19353,16 +18902,16 @@
           <w:lang w:eastAsia="es-ES"/>
         </w:rPr>
       </w:pPr>
-      <w:bookmarkStart w:id="49" w:name="_Toc234511673"/>
-      <w:bookmarkStart w:id="50" w:name="_Toc234525111"/>
-      <w:bookmarkEnd w:id="49"/>
+      <w:bookmarkStart w:id="51" w:name="_Toc234511673"/>
+      <w:bookmarkStart w:id="52" w:name="_Toc234525111"/>
+      <w:bookmarkEnd w:id="51"/>
       <w:r>
         <w:rPr>
           <w:lang w:eastAsia="es-ES"/>
         </w:rPr>
         <w:t>Option B: temporal split</w:t>
       </w:r>
-      <w:bookmarkEnd w:id="50"/>
+      <w:bookmarkEnd w:id="52"/>
     </w:p>
     <w:p>
       <w:pPr>
@@ -19552,11 +19101,11 @@
       <w:pPr>
         <w:pStyle w:val="Heading3"/>
       </w:pPr>
-      <w:bookmarkStart w:id="51" w:name="_Toc234525112"/>
+      <w:bookmarkStart w:id="53" w:name="_Toc234525112"/>
       <w:r>
         <w:t>Correlation study</w:t>
       </w:r>
-      <w:bookmarkEnd w:id="51"/>
+      <w:bookmarkEnd w:id="53"/>
     </w:p>
     <w:p>
       <w:pPr>
@@ -19660,6 +19209,7 @@
           <w:color w:val="C00000"/>
           <w:lang w:eastAsia="es-ES"/>
         </w:rPr>
+        <w:instrText xml:space="preserve"> \* MERGEFORMAT </w:instrText>
       </w:r>
       <w:r>
         <w:rPr>
@@ -19669,7 +19219,6 @@
           <w:color w:val="C00000"/>
           <w:lang w:eastAsia="es-ES"/>
         </w:rPr>
-        <w:instrText xml:space="preserve"> \* MERGEFORMAT </w:instrText>
       </w:r>
       <w:r>
         <w:rPr>
@@ -19722,7 +19271,7 @@
           <w:color w:val="C00000"/>
           <w:lang w:eastAsia="es-ES"/>
         </w:rPr>
-        <w:instrText xml:space="preserve"> REF _Ref234496361 \h </w:instrText>
+        <w:instrText xml:space="preserve"> REF _Ref234496361 \h  \* MERGEFORMAT </w:instrText>
       </w:r>
       <w:r>
         <w:rPr>
@@ -19741,26 +19290,10 @@
           <w:color w:val="C00000"/>
           <w:lang w:eastAsia="es-ES"/>
         </w:rPr>
-        <w:instrText xml:space="preserve"> \* MERGEFORMAT </w:instrText>
-      </w:r>
-      <w:r>
-        <w:rPr>
-          <w:rFonts w:eastAsia="Times New Roman" w:cs="Segoe UI"/>
-          <w:b/>
-          <w:bCs/>
-          <w:color w:val="C00000"/>
-          <w:lang w:eastAsia="es-ES"/>
-        </w:rPr>
         <w:fldChar w:fldCharType="separate"/>
       </w:r>
       <w:r>
-        <w:t>Figure 4</w:t>
-      </w:r>
-      <w:r>
-        <w:t>.</w:t>
-      </w:r>
-      <w:r>
-        <w:t>3</w:t>
+        <w:t>Figure 4.3</w:t>
       </w:r>
       <w:r>
         <w:rPr>
@@ -20176,7 +19709,8 @@
       <w:pPr>
         <w:pStyle w:val="Heading3"/>
       </w:pPr>
-      <w:bookmarkStart w:id="52" w:name="_Toc234525113"/>
+      <w:bookmarkStart w:id="54" w:name="_Toc234525113"/>
+      <w:bookmarkStart w:id="55" w:name="_Ref234907146"/>
       <w:r>
         <w:lastRenderedPageBreak/>
         <w:t>Scaling of i</w:t>
@@ -20184,7 +19718,8 @@
       <w:r>
         <w:t>ndicators</w:t>
       </w:r>
-      <w:bookmarkEnd w:id="52"/>
+      <w:bookmarkEnd w:id="54"/>
+      <w:bookmarkEnd w:id="55"/>
     </w:p>
     <w:p>
       <w:pPr>
@@ -20793,44 +20328,152 @@
           <w:lang w:eastAsia="es-ES"/>
         </w:rPr>
       </w:pPr>
-      <w:bookmarkStart w:id="53" w:name="_Ref234523693"/>
-      <w:bookmarkStart w:id="54" w:name="_Ref234523716"/>
-      <w:bookmarkStart w:id="55" w:name="_Ref234523787"/>
-      <w:bookmarkStart w:id="56" w:name="_Toc234525119"/>
-      <w:r>
-        <w:rPr>
-          <w:lang w:eastAsia="es-ES"/>
-        </w:rPr>
-        <w:t>Clustering methods (Unsupervised learning)</w:t>
-      </w:r>
-      <w:bookmarkEnd w:id="53"/>
-      <w:bookmarkEnd w:id="54"/>
-      <w:bookmarkEnd w:id="55"/>
+      <w:bookmarkStart w:id="56" w:name="_Toc234525114"/>
+      <w:r>
+        <w:rPr>
+          <w:lang w:eastAsia="es-ES"/>
+        </w:rPr>
+        <w:t>Model creation (Supervised learning)</w:t>
+      </w:r>
       <w:bookmarkEnd w:id="56"/>
     </w:p>
     <w:p>
       <w:pPr>
         <w:rPr>
-          <w:rFonts w:eastAsia="Times New Roman" w:cs="Segoe UI"/>
-          <w:lang w:eastAsia="es-ES"/>
-        </w:rPr>
-      </w:pPr>
-    </w:p>
-    <w:p>
-      <w:pPr>
-        <w:pStyle w:val="Heading2"/>
-        <w:rPr>
-          <w:lang w:eastAsia="es-ES"/>
-        </w:rPr>
-      </w:pPr>
-      <w:bookmarkStart w:id="57" w:name="_Toc234525114"/>
-      <w:r>
-        <w:rPr>
-          <w:lang w:eastAsia="es-ES"/>
-        </w:rPr>
-        <w:t>Model creation (Supervised learning)</w:t>
-      </w:r>
-      <w:bookmarkEnd w:id="57"/>
+          <w:lang w:eastAsia="es-ES"/>
+        </w:rPr>
+      </w:pPr>
+      <w:r>
+        <w:rPr>
+          <w:lang w:eastAsia="es-ES"/>
+        </w:rPr>
+        <w:t xml:space="preserve">This section showcases the six panel regression models used for the development of the Thesis, each trained under both Option A (geographical split) and Option B (temporal split). All six share the same predictor set – the socioeconomic and mental health indicators surviving the multicollinearity check in Section </w:t>
+      </w:r>
+      <w:r>
+        <w:rPr>
+          <w:lang w:eastAsia="es-ES"/>
+        </w:rPr>
+        <w:fldChar w:fldCharType="begin"/>
+      </w:r>
+      <w:r>
+        <w:rPr>
+          <w:lang w:eastAsia="es-ES"/>
+        </w:rPr>
+        <w:instrText xml:space="preserve"> REF _Ref234907074 \h </w:instrText>
+      </w:r>
+      <w:r>
+        <w:rPr>
+          <w:lang w:eastAsia="es-ES"/>
+        </w:rPr>
+      </w:r>
+      <w:r>
+        <w:rPr>
+          <w:lang w:eastAsia="es-ES"/>
+        </w:rPr>
+        <w:fldChar w:fldCharType="separate"/>
+      </w:r>
+      <w:r>
+        <w:rPr>
+          <w:lang w:eastAsia="es-ES"/>
+        </w:rPr>
+        <w:fldChar w:fldCharType="end"/>
+      </w:r>
+      <w:r>
+        <w:rPr>
+          <w:lang w:eastAsia="es-ES"/>
+        </w:rPr>
+        <w:fldChar w:fldCharType="begin"/>
+      </w:r>
+      <w:r>
+        <w:rPr>
+          <w:lang w:eastAsia="es-ES"/>
+        </w:rPr>
+        <w:instrText xml:space="preserve"> REF _Ref234907081 \r \h </w:instrText>
+      </w:r>
+      <w:r>
+        <w:rPr>
+          <w:lang w:eastAsia="es-ES"/>
+        </w:rPr>
+      </w:r>
+      <w:r>
+        <w:rPr>
+          <w:lang w:eastAsia="es-ES"/>
+        </w:rPr>
+        <w:fldChar w:fldCharType="separate"/>
+      </w:r>
+      <w:r>
+        <w:rPr>
+          <w:lang w:eastAsia="es-ES"/>
+        </w:rPr>
+        <w:t>3.4.6</w:t>
+      </w:r>
+      <w:r>
+        <w:rPr>
+          <w:lang w:eastAsia="es-ES"/>
+        </w:rPr>
+        <w:fldChar w:fldCharType="end"/>
+      </w:r>
+      <w:r>
+        <w:rPr>
+          <w:lang w:eastAsia="es-ES"/>
+        </w:rPr>
+        <w:t xml:space="preserve"> – scaled with </w:t>
+      </w:r>
+      <w:proofErr w:type="spellStart"/>
+      <w:r>
+        <w:rPr>
+          <w:lang w:eastAsia="es-ES"/>
+        </w:rPr>
+        <w:t>RobustScaler</w:t>
+      </w:r>
+      <w:proofErr w:type="spellEnd"/>
+      <w:r>
+        <w:rPr>
+          <w:lang w:eastAsia="es-ES"/>
+        </w:rPr>
+        <w:t xml:space="preserve"> described in Section </w:t>
+      </w:r>
+      <w:r>
+        <w:rPr>
+          <w:lang w:eastAsia="es-ES"/>
+        </w:rPr>
+        <w:fldChar w:fldCharType="begin"/>
+      </w:r>
+      <w:r>
+        <w:rPr>
+          <w:lang w:eastAsia="es-ES"/>
+        </w:rPr>
+        <w:instrText xml:space="preserve"> REF _Ref234907146 \r \h </w:instrText>
+      </w:r>
+      <w:r>
+        <w:rPr>
+          <w:lang w:eastAsia="es-ES"/>
+        </w:rPr>
+      </w:r>
+      <w:r>
+        <w:rPr>
+          <w:lang w:eastAsia="es-ES"/>
+        </w:rPr>
+        <w:fldChar w:fldCharType="separate"/>
+      </w:r>
+      <w:r>
+        <w:rPr>
+          <w:lang w:eastAsia="es-ES"/>
+        </w:rPr>
+        <w:t>3.5.4</w:t>
+      </w:r>
+      <w:r>
+        <w:rPr>
+          <w:lang w:eastAsia="es-ES"/>
+        </w:rPr>
+        <w:fldChar w:fldCharType="end"/>
+      </w:r>
+      <w:r>
+        <w:rPr>
+          <w:lang w:eastAsia="es-ES"/>
+        </w:rPr>
+        <w:t>.</w:t>
+      </w:r>
     </w:p>
     <w:p>
       <w:pPr>
@@ -20841,28 +20484,92 @@
           <w:lang w:eastAsia="es-ES"/>
         </w:rPr>
       </w:pPr>
-      <w:bookmarkStart w:id="58" w:name="_Toc234525115"/>
+      <w:bookmarkStart w:id="57" w:name="_Toc234525115"/>
       <w:r>
         <w:rPr>
           <w:lang w:eastAsia="es-ES"/>
         </w:rPr>
         <w:t>Model selection and applicability</w:t>
       </w:r>
+      <w:bookmarkEnd w:id="57"/>
+    </w:p>
+    <w:p>
+      <w:pPr>
+        <w:rPr>
+          <w:lang w:eastAsia="es-ES"/>
+        </w:rPr>
+      </w:pPr>
+      <w:r>
+        <w:rPr>
+          <w:lang w:eastAsia="es-ES"/>
+        </w:rPr>
+        <w:t xml:space="preserve">Six models were selected to span a spectrum from fully interpretable linear baselines to non-linear kernel and tree-ensemble methos, implemented via src/models.py and </w:t>
+      </w:r>
+      <w:r>
+        <w:rPr>
+          <w:lang w:eastAsia="es-ES"/>
+        </w:rPr>
+        <w:lastRenderedPageBreak/>
+        <w:t xml:space="preserve">tuned with </w:t>
+      </w:r>
+      <w:proofErr w:type="spellStart"/>
+      <w:r>
+        <w:rPr>
+          <w:lang w:eastAsia="es-ES"/>
+        </w:rPr>
+        <w:t>GridSearchCV</w:t>
+      </w:r>
+      <w:proofErr w:type="spellEnd"/>
+      <w:r>
+        <w:rPr>
+          <w:lang w:eastAsia="es-ES"/>
+        </w:rPr>
+        <w:t>, which performs an exhaustive search over a fixed hyperparameter grid, using cross-validation exclusively within the training set.</w:t>
+      </w:r>
+    </w:p>
+    <w:p>
+      <w:pPr>
+        <w:rPr>
+          <w:lang w:eastAsia="es-ES"/>
+        </w:rPr>
+      </w:pPr>
+    </w:p>
+    <w:p>
+      <w:pPr>
+        <w:pStyle w:val="Heading3"/>
+        <w:rPr>
+          <w:lang w:eastAsia="es-ES"/>
+        </w:rPr>
+      </w:pPr>
+      <w:bookmarkStart w:id="58" w:name="_Toc234525116"/>
+      <w:r>
+        <w:rPr>
+          <w:lang w:eastAsia="es-ES"/>
+        </w:rPr>
+        <w:t>Results comparison</w:t>
+      </w:r>
       <w:bookmarkEnd w:id="58"/>
     </w:p>
     <w:p>
       <w:pPr>
+        <w:rPr>
+          <w:lang w:eastAsia="es-ES"/>
+        </w:rPr>
+      </w:pPr>
+    </w:p>
+    <w:p>
+      <w:pPr>
         <w:pStyle w:val="Heading3"/>
         <w:rPr>
           <w:lang w:eastAsia="es-ES"/>
         </w:rPr>
       </w:pPr>
-      <w:bookmarkStart w:id="59" w:name="_Toc234525116"/>
-      <w:r>
-        <w:rPr>
-          <w:lang w:eastAsia="es-ES"/>
-        </w:rPr>
-        <w:t>Results comparison</w:t>
+      <w:bookmarkStart w:id="59" w:name="_Toc234525117"/>
+      <w:r>
+        <w:rPr>
+          <w:lang w:eastAsia="es-ES"/>
+        </w:rPr>
+        <w:t>Results diagnostics and interpretability</w:t>
       </w:r>
       <w:bookmarkEnd w:id="59"/>
     </w:p>
@@ -20880,96 +20587,105 @@
           <w:lang w:eastAsia="es-ES"/>
         </w:rPr>
       </w:pPr>
-      <w:bookmarkStart w:id="60" w:name="_Toc234525117"/>
-      <w:r>
-        <w:rPr>
-          <w:lang w:eastAsia="es-ES"/>
-        </w:rPr>
-        <w:lastRenderedPageBreak/>
-        <w:t>Results diagnostics and interpretability</w:t>
+      <w:bookmarkStart w:id="60" w:name="_Toc234525118"/>
+      <w:r>
+        <w:rPr>
+          <w:lang w:eastAsia="es-ES"/>
+        </w:rPr>
+        <w:t>Model improvement experiments</w:t>
       </w:r>
       <w:bookmarkEnd w:id="60"/>
     </w:p>
     <w:p>
       <w:pPr>
         <w:rPr>
-          <w:lang w:eastAsia="es-ES"/>
-        </w:rPr>
-      </w:pPr>
-    </w:p>
-    <w:p>
-      <w:pPr>
-        <w:pStyle w:val="Heading3"/>
-        <w:rPr>
-          <w:lang w:eastAsia="es-ES"/>
-        </w:rPr>
-      </w:pPr>
-      <w:bookmarkStart w:id="61" w:name="_Toc234525118"/>
-      <w:r>
-        <w:rPr>
-          <w:lang w:eastAsia="es-ES"/>
-        </w:rPr>
-        <w:t>Model improvement experiments</w:t>
+          <w:rFonts w:eastAsia="Times New Roman" w:cs="Segoe UI"/>
+          <w:lang w:eastAsia="es-ES"/>
+        </w:rPr>
+      </w:pPr>
+    </w:p>
+    <w:p>
+      <w:pPr>
+        <w:pStyle w:val="Heading2"/>
+        <w:rPr>
+          <w:lang w:eastAsia="es-ES"/>
+        </w:rPr>
+      </w:pPr>
+      <w:bookmarkStart w:id="61" w:name="_Ref234523693"/>
+      <w:bookmarkStart w:id="62" w:name="_Ref234523716"/>
+      <w:bookmarkStart w:id="63" w:name="_Ref234523787"/>
+      <w:bookmarkStart w:id="64" w:name="_Toc234525119"/>
+      <w:r>
+        <w:rPr>
+          <w:lang w:eastAsia="es-ES"/>
+        </w:rPr>
+        <w:t>Clustering methods (Unsupervised learning)</w:t>
       </w:r>
       <w:bookmarkEnd w:id="61"/>
-    </w:p>
-    <w:p>
-      <w:pPr>
-        <w:rPr>
-          <w:rFonts w:eastAsia="Times New Roman" w:cs="Segoe UI"/>
-          <w:lang w:eastAsia="es-ES"/>
-        </w:rPr>
-      </w:pPr>
-    </w:p>
-    <w:p>
-      <w:pPr>
-        <w:pStyle w:val="Heading1"/>
-        <w:rPr>
-          <w:lang w:eastAsia="es-ES"/>
-        </w:rPr>
-      </w:pPr>
-      <w:r>
-        <w:rPr>
-          <w:lang w:eastAsia="es-ES"/>
-        </w:rPr>
-        <w:t>Conclusions</w:t>
-      </w:r>
-    </w:p>
-    <w:p>
-      <w:pPr>
-        <w:pStyle w:val="Heading2"/>
-        <w:rPr>
-          <w:lang w:eastAsia="es-ES"/>
-        </w:rPr>
-      </w:pPr>
-      <w:r>
-        <w:rPr>
-          <w:lang w:eastAsia="es-ES"/>
-        </w:rPr>
-        <w:t>Future lines of work</w:t>
-      </w:r>
-      <w:r>
-        <w:rPr>
-          <w:lang w:eastAsia="es-ES"/>
-        </w:rPr>
-        <w:br w:type="page"/>
-      </w:r>
-    </w:p>
-    <w:p>
-      <w:pPr>
-        <w:pStyle w:val="Heading1"/>
-        <w:rPr>
-          <w:lang w:eastAsia="es-ES"/>
-        </w:rPr>
-      </w:pPr>
-      <w:bookmarkStart w:id="62" w:name="_Toc234245598"/>
-      <w:bookmarkStart w:id="63" w:name="_Toc234245636"/>
-      <w:bookmarkStart w:id="64" w:name="_Toc234247105"/>
-      <w:bookmarkStart w:id="65" w:name="_Toc234525120"/>
       <w:bookmarkEnd w:id="62"/>
       <w:bookmarkEnd w:id="63"/>
       <w:bookmarkEnd w:id="64"/>
-      <w:r>
+    </w:p>
+    <w:p>
+      <w:pPr>
+        <w:rPr>
+          <w:rFonts w:eastAsia="Times New Roman" w:cs="Segoe UI"/>
+          <w:lang w:eastAsia="es-ES"/>
+        </w:rPr>
+      </w:pPr>
+    </w:p>
+    <w:p>
+      <w:pPr>
+        <w:pStyle w:val="Heading1"/>
+        <w:rPr>
+          <w:lang w:eastAsia="es-ES"/>
+        </w:rPr>
+      </w:pPr>
+      <w:r>
+        <w:rPr>
+          <w:lang w:eastAsia="es-ES"/>
+        </w:rPr>
+        <w:t>Conclusions</w:t>
+      </w:r>
+    </w:p>
+    <w:p>
+      <w:pPr>
+        <w:pStyle w:val="Heading2"/>
+        <w:rPr>
+          <w:lang w:eastAsia="es-ES"/>
+        </w:rPr>
+      </w:pPr>
+      <w:r>
+        <w:rPr>
+          <w:lang w:eastAsia="es-ES"/>
+        </w:rPr>
+        <w:t>Future lines of work</w:t>
+      </w:r>
+      <w:r>
+        <w:rPr>
+          <w:lang w:eastAsia="es-ES"/>
+        </w:rPr>
+        <w:br w:type="page"/>
+      </w:r>
+    </w:p>
+    <w:p>
+      <w:pPr>
+        <w:pStyle w:val="Heading1"/>
+        <w:rPr>
+          <w:lang w:eastAsia="es-ES"/>
+        </w:rPr>
+      </w:pPr>
+      <w:bookmarkStart w:id="65" w:name="_Toc234245598"/>
+      <w:bookmarkStart w:id="66" w:name="_Toc234245636"/>
+      <w:bookmarkStart w:id="67" w:name="_Toc234247105"/>
+      <w:bookmarkStart w:id="68" w:name="_Toc234525120"/>
+      <w:bookmarkEnd w:id="65"/>
+      <w:bookmarkEnd w:id="66"/>
+      <w:bookmarkEnd w:id="67"/>
+      <w:r>
+        <w:rPr>
+          <w:noProof/>
+        </w:rPr>
         <w:lastRenderedPageBreak/>
         <mc:AlternateContent>
           <mc:Choice Requires="wps">
@@ -21091,13 +20807,7 @@
                               <w:rPr>
                                 <w:lang w:val="en-GB"/>
                               </w:rPr>
-                              <w:t xml:space="preserve">: </w:t>
-                            </w:r>
-                            <w:r>
-                              <w:rPr>
-                                <w:lang w:val="en-GB"/>
-                              </w:rPr>
-                              <w:t>Distribution of numerical explanatory variables in the EU Development Dataset (2000–2021). Histograms and kernel density estimates (KDE) illustrate variability, skewness, and distributional patterns across socioeconomic, demographic, healthcare, and mental health indicators.</w:t>
+                              <w:t>: Distribution of numerical explanatory variables in the EU Development Dataset (2000–2021). Histograms and kernel density estimates (KDE) illustrate variability, skewness, and distributional patterns across socioeconomic, demographic, healthcare, and mental health indicators.</w:t>
                             </w:r>
                           </w:p>
                         </w:txbxContent>
@@ -21205,13 +20915,7 @@
                         <w:rPr>
                           <w:lang w:val="en-GB"/>
                         </w:rPr>
-                        <w:t xml:space="preserve">: </w:t>
-                      </w:r>
-                      <w:r>
-                        <w:rPr>
-                          <w:lang w:val="en-GB"/>
-                        </w:rPr>
-                        <w:t>Distribution of numerical explanatory variables in the EU Development Dataset (2000–2021). Histograms and kernel density estimates (KDE) illustrate variability, skewness, and distributional patterns across socioeconomic, demographic, healthcare, and mental health indicators.</w:t>
+                        <w:t>: Distribution of numerical explanatory variables in the EU Development Dataset (2000–2021). Histograms and kernel density estimates (KDE) illustrate variability, skewness, and distributional patterns across socioeconomic, demographic, healthcare, and mental health indicators.</w:t>
                       </w:r>
                     </w:p>
                   </w:txbxContent>
@@ -21223,6 +20927,9 @@
         </mc:AlternateContent>
       </w:r>
       <w:r>
+        <w:rPr>
+          <w:noProof/>
+        </w:rPr>
         <w:drawing>
           <wp:anchor distT="0" distB="0" distL="114300" distR="114300" simplePos="0" relativeHeight="251747328" behindDoc="0" locked="0" layoutInCell="1" allowOverlap="1" wp14:anchorId="6A2697C2" wp14:editId="6E89DD63">
             <wp:simplePos x="0" y="0"/>
@@ -21281,19 +20988,19 @@
           </wp:anchor>
         </w:drawing>
       </w:r>
-      <w:bookmarkStart w:id="66" w:name="_Toc234511691"/>
-      <w:bookmarkStart w:id="67" w:name="_Toc234511692"/>
-      <w:bookmarkStart w:id="68" w:name="_Ref234496967"/>
-      <w:bookmarkEnd w:id="66"/>
-      <w:bookmarkEnd w:id="67"/>
+      <w:bookmarkStart w:id="69" w:name="_Toc234511691"/>
+      <w:bookmarkStart w:id="70" w:name="_Toc234511692"/>
+      <w:bookmarkStart w:id="71" w:name="_Ref234496967"/>
+      <w:bookmarkEnd w:id="69"/>
+      <w:bookmarkEnd w:id="70"/>
       <w:r>
         <w:t>A</w:t>
       </w:r>
       <w:r>
         <w:t>ppendix: full-page graphics</w:t>
       </w:r>
-      <w:bookmarkEnd w:id="65"/>
       <w:bookmarkEnd w:id="68"/>
+      <w:bookmarkEnd w:id="71"/>
     </w:p>
     <w:p>
       <w:pPr>
@@ -21314,6 +21021,7 @@
       <w:r>
         <w:rPr>
           <w:rFonts w:eastAsia="Times New Roman" w:cs="Segoe UI"/>
+          <w:noProof/>
           <w:lang w:eastAsia="es-ES"/>
         </w:rPr>
         <w:lastRenderedPageBreak/>
@@ -21376,6 +21084,9 @@
         </w:drawing>
       </w:r>
       <w:r>
+        <w:rPr>
+          <w:noProof/>
+        </w:rPr>
         <mc:AlternateContent>
           <mc:Choice Requires="wps">
             <w:drawing>
@@ -21423,7 +21134,7 @@
                                 <w:lang w:val="en-GB" w:eastAsia="es-ES"/>
                               </w:rPr>
                             </w:pPr>
-                            <w:bookmarkStart w:id="69" w:name="_Ref234495581"/>
+                            <w:bookmarkStart w:id="72" w:name="_Ref234495581"/>
                             <w:r>
                               <w:rPr>
                                 <w:lang w:val="en-GB"/>
@@ -21496,18 +21207,12 @@
                               </w:rPr>
                               <w:fldChar w:fldCharType="end"/>
                             </w:r>
-                            <w:bookmarkEnd w:id="69"/>
+                            <w:bookmarkEnd w:id="72"/>
                             <w:r>
                               <w:rPr>
                                 <w:lang w:val="en-GB"/>
                               </w:rPr>
-                              <w:t xml:space="preserve">: </w:t>
-                            </w:r>
-                            <w:r>
-                              <w:rPr>
-                                <w:lang w:val="en-GB"/>
-                              </w:rPr>
-                              <w:t>Correlation matrices showing the relationships between suicide rates, socio-economic factors, and mental health indicators across all variables included in the study</w:t>
+                              <w:t>: Correlation matrices showing the relationships between suicide rates, socio-economic factors, and mental health indicators across all variables included in the study</w:t>
                             </w:r>
                             <w:r>
                               <w:rPr>
@@ -21554,7 +21259,7 @@
                           <w:lang w:val="en-GB" w:eastAsia="es-ES"/>
                         </w:rPr>
                       </w:pPr>
-                      <w:bookmarkStart w:id="70" w:name="_Ref234495581"/>
+                      <w:bookmarkStart w:id="73" w:name="_Ref234495581"/>
                       <w:r>
                         <w:rPr>
                           <w:lang w:val="en-GB"/>
@@ -21627,18 +21332,12 @@
                         </w:rPr>
                         <w:fldChar w:fldCharType="end"/>
                       </w:r>
-                      <w:bookmarkEnd w:id="70"/>
+                      <w:bookmarkEnd w:id="73"/>
                       <w:r>
                         <w:rPr>
                           <w:lang w:val="en-GB"/>
                         </w:rPr>
-                        <w:t xml:space="preserve">: </w:t>
-                      </w:r>
-                      <w:r>
-                        <w:rPr>
-                          <w:lang w:val="en-GB"/>
-                        </w:rPr>
-                        <w:t>Correlation matrices showing the relationships between suicide rates, socio-economic factors, and mental health indicators across all variables included in the study</w:t>
+                        <w:t>: Correlation matrices showing the relationships between suicide rates, socio-economic factors, and mental health indicators across all variables included in the study</w:t>
                       </w:r>
                       <w:r>
                         <w:rPr>
@@ -21664,6 +21363,9 @@
     </w:p>
     <w:p>
       <w:r>
+        <w:rPr>
+          <w:noProof/>
+        </w:rPr>
         <w:lastRenderedPageBreak/>
         <mc:AlternateContent>
           <mc:Choice Requires="wps">
@@ -21711,7 +21413,7 @@
                                 <w:lang w:val="en-GB"/>
                               </w:rPr>
                             </w:pPr>
-                            <w:bookmarkStart w:id="71" w:name="_Ref234496361"/>
+                            <w:bookmarkStart w:id="74" w:name="_Ref234496361"/>
                             <w:r>
                               <w:rPr>
                                 <w:lang w:val="en-GB"/>
@@ -21784,30 +21486,12 @@
                               </w:rPr>
                               <w:fldChar w:fldCharType="end"/>
                             </w:r>
-                            <w:bookmarkEnd w:id="71"/>
+                            <w:bookmarkEnd w:id="74"/>
                             <w:r>
                               <w:rPr>
                                 <w:lang w:val="en-GB"/>
                               </w:rPr>
-                              <w:t xml:space="preserve">: </w:t>
-                            </w:r>
-                            <w:r>
-                              <w:rPr>
-                                <w:lang w:val="en-GB"/>
-                              </w:rPr>
-                              <w:t xml:space="preserve">Correlation matrices showing the relationships between suicide rates, socio-economic factors, and mental health indicators across all variables included in the study in the </w:t>
-                            </w:r>
-                            <w:r>
-                              <w:rPr>
-                                <w:lang w:val="en-GB"/>
-                              </w:rPr>
-                              <w:t>temporal</w:t>
-                            </w:r>
-                            <w:r>
-                              <w:rPr>
-                                <w:lang w:val="en-GB"/>
-                              </w:rPr>
-                              <w:t xml:space="preserve"> split.</w:t>
+                              <w:t>: Correlation matrices showing the relationships between suicide rates, socio-economic factors, and mental health indicators across all variables included in the study in the temporal split.</w:t>
                             </w:r>
                           </w:p>
                         </w:txbxContent>
@@ -21841,7 +21525,7 @@
                           <w:lang w:val="en-GB"/>
                         </w:rPr>
                       </w:pPr>
-                      <w:bookmarkStart w:id="72" w:name="_Ref234496361"/>
+                      <w:bookmarkStart w:id="75" w:name="_Ref234496361"/>
                       <w:r>
                         <w:rPr>
                           <w:lang w:val="en-GB"/>
@@ -21914,30 +21598,12 @@
                         </w:rPr>
                         <w:fldChar w:fldCharType="end"/>
                       </w:r>
-                      <w:bookmarkEnd w:id="72"/>
+                      <w:bookmarkEnd w:id="75"/>
                       <w:r>
                         <w:rPr>
                           <w:lang w:val="en-GB"/>
                         </w:rPr>
-                        <w:t xml:space="preserve">: </w:t>
-                      </w:r>
-                      <w:r>
-                        <w:rPr>
-                          <w:lang w:val="en-GB"/>
-                        </w:rPr>
-                        <w:t xml:space="preserve">Correlation matrices showing the relationships between suicide rates, socio-economic factors, and mental health indicators across all variables included in the study in the </w:t>
-                      </w:r>
-                      <w:r>
-                        <w:rPr>
-                          <w:lang w:val="en-GB"/>
-                        </w:rPr>
-                        <w:t>temporal</w:t>
-                      </w:r>
-                      <w:r>
-                        <w:rPr>
-                          <w:lang w:val="en-GB"/>
-                        </w:rPr>
-                        <w:t xml:space="preserve"> split.</w:t>
+                        <w:t>: Correlation matrices showing the relationships between suicide rates, socio-economic factors, and mental health indicators across all variables included in the study in the temporal split.</w:t>
                       </w:r>
                     </w:p>
                   </w:txbxContent>
@@ -21949,6 +21615,9 @@
         </mc:AlternateContent>
       </w:r>
       <w:r>
+        <w:rPr>
+          <w:noProof/>
+        </w:rPr>
         <w:drawing>
           <wp:anchor distT="0" distB="0" distL="114300" distR="114300" simplePos="0" relativeHeight="251750400" behindDoc="0" locked="0" layoutInCell="1" allowOverlap="1" wp14:anchorId="03CE175C" wp14:editId="3D8B1BE5">
             <wp:simplePos x="0" y="0"/>
@@ -22019,12 +21688,12 @@
       <w:pPr>
         <w:pStyle w:val="Heading1"/>
       </w:pPr>
-      <w:bookmarkStart w:id="73" w:name="_Toc234525121"/>
+      <w:bookmarkStart w:id="76" w:name="_Toc234525121"/>
       <w:r>
         <w:lastRenderedPageBreak/>
         <w:t>BIBLIOGRAPHY</w:t>
       </w:r>
-      <w:bookmarkEnd w:id="73"/>
+      <w:bookmarkEnd w:id="76"/>
     </w:p>
     <w:p>
       <w:pPr>
@@ -22113,15 +21782,7 @@
         <w:pStyle w:val="Bibliography"/>
       </w:pPr>
       <w:r>
-        <w:t xml:space="preserve">Hawton, K., &amp; </w:t>
-      </w:r>
-      <w:proofErr w:type="spellStart"/>
-      <w:r>
-        <w:t>Pirkis</w:t>
-      </w:r>
-      <w:proofErr w:type="spellEnd"/>
-      <w:r>
-        <w:t xml:space="preserve">, J. (2024). Preventing suicide: A call to action. </w:t>
+        <w:t xml:space="preserve">Hawton, K., &amp; Pirkis, J. (2024). Preventing suicide: A call to action. </w:t>
       </w:r>
       <w:r>
         <w:rPr>
@@ -22177,15 +21838,7 @@
         <w:pStyle w:val="Bibliography"/>
       </w:pPr>
       <w:r>
-        <w:t xml:space="preserve">Na, P. J., Shin, J., Kwak, H. R., Lee, J., Jester, D. J., Bandara, P., Kim, J. Y., Moutier, C. Y., Pietrzak, R. H., Oquendo, M. A., &amp; </w:t>
-      </w:r>
-      <w:proofErr w:type="spellStart"/>
-      <w:r>
-        <w:t>Jeste</w:t>
-      </w:r>
-      <w:proofErr w:type="spellEnd"/>
-      <w:r>
-        <w:t xml:space="preserve">, D. V. (2025). Social Determinants of </w:t>
+        <w:t xml:space="preserve">Na, P. J., Shin, J., Kwak, H. R., Lee, J., Jester, D. J., Bandara, P., Kim, J. Y., Moutier, C. Y., Pietrzak, R. H., Oquendo, M. A., &amp; Jeste, D. V. (2025). Social Determinants of </w:t>
       </w:r>
       <w:r>
         <w:lastRenderedPageBreak/>
@@ -22217,15 +21870,7 @@
         <w:pStyle w:val="Bibliography"/>
       </w:pPr>
       <w:r>
-        <w:t xml:space="preserve">Nadeem Parpio, Y., Nuruddin, R., Ali, T. S., Mohammad, N., Khan, U. R., Shahzad, S., Khan, M. M., &amp; Aslam, M. (2025). Suicide prevention program on suicidal </w:t>
-      </w:r>
-      <w:proofErr w:type="spellStart"/>
-      <w:r>
-        <w:t>behaviors</w:t>
-      </w:r>
-      <w:proofErr w:type="spellEnd"/>
-      <w:r>
-        <w:t xml:space="preserve"> and mental wellbeing among school aged adolescents: A scoping review. </w:t>
+        <w:t xml:space="preserve">Nadeem Parpio, Y., Nuruddin, R., Ali, T. S., Mohammad, N., Khan, U. R., Shahzad, S., Khan, M. M., &amp; Aslam, M. (2025). Suicide prevention program on suicidal behaviors and mental wellbeing among school aged adolescents: A scoping review. </w:t>
       </w:r>
       <w:r>
         <w:rPr>
@@ -22284,15 +21929,7 @@
         <w:pStyle w:val="Bibliography"/>
       </w:pPr>
       <w:r>
-        <w:t xml:space="preserve">O’Connor, R. C., Kirtley, O. J., &amp; De </w:t>
-      </w:r>
-      <w:proofErr w:type="spellStart"/>
-      <w:r>
-        <w:t>Beurs</w:t>
-      </w:r>
-      <w:proofErr w:type="spellEnd"/>
-      <w:r>
-        <w:t xml:space="preserve">, D. (2024). Preventing suicide: Understanding the complex interplay between individual and societal factors. </w:t>
+        <w:t xml:space="preserve">O’Connor, R. C., Kirtley, O. J., &amp; De Beurs, D. (2024). Preventing suicide: Understanding the complex interplay between individual and societal factors. </w:t>
       </w:r>
       <w:r>
         <w:rPr>
@@ -22320,15 +21957,7 @@
         <w:pStyle w:val="Bibliography"/>
       </w:pPr>
       <w:r>
-        <w:t xml:space="preserve">Pirkis, J., </w:t>
-      </w:r>
-      <w:proofErr w:type="spellStart"/>
-      <w:r>
-        <w:t>Dandona</w:t>
-      </w:r>
-      <w:proofErr w:type="spellEnd"/>
-      <w:r>
-        <w:t xml:space="preserve">, R., Silverman, M., Khan, M., &amp; Hawton, K. (2024). Preventing suicide: A public health approach to a global problem. </w:t>
+        <w:t xml:space="preserve">Pirkis, J., Dandona, R., Silverman, M., Khan, M., &amp; Hawton, K. (2024). Preventing suicide: A public health approach to a global problem. </w:t>
       </w:r>
       <w:r>
         <w:rPr>
@@ -22355,29 +21984,8 @@
       <w:pPr>
         <w:pStyle w:val="Bibliography"/>
       </w:pPr>
-      <w:proofErr w:type="spellStart"/>
-      <w:r>
-        <w:t>Pranckeviciene</w:t>
-      </w:r>
-      <w:proofErr w:type="spellEnd"/>
-      <w:r>
-        <w:t xml:space="preserve">, E., &amp; </w:t>
-      </w:r>
-      <w:proofErr w:type="spellStart"/>
-      <w:r>
-        <w:t>Kasperiuniene</w:t>
-      </w:r>
-      <w:proofErr w:type="spellEnd"/>
-      <w:r>
-        <w:t xml:space="preserve">, J. (2024). Global Suicide Mortality Rates (2000–2019): Clustering, Themes, and Causes </w:t>
-      </w:r>
-      <w:proofErr w:type="spellStart"/>
-      <w:r>
-        <w:t>Analyzed</w:t>
-      </w:r>
-      <w:proofErr w:type="spellEnd"/>
-      <w:r>
-        <w:t xml:space="preserve"> through Machine Learning and Bibliographic Data. </w:t>
+      <w:r>
+        <w:t xml:space="preserve">Pranckeviciene, E., &amp; Kasperiuniene, J. (2024). Global Suicide Mortality Rates (2000–2019): Clustering, Themes, and Causes Analyzed through Machine Learning and Bibliographic Data. </w:t>
       </w:r>
       <w:r>
         <w:rPr>
@@ -22404,57 +22012,12 @@
       <w:pPr>
         <w:pStyle w:val="Bibliography"/>
       </w:pPr>
-      <w:proofErr w:type="spellStart"/>
-      <w:r>
-        <w:t>Rotejanaprasert</w:t>
-      </w:r>
-      <w:proofErr w:type="spellEnd"/>
-      <w:r>
-        <w:t xml:space="preserve">, C., </w:t>
-      </w:r>
-      <w:proofErr w:type="spellStart"/>
-      <w:r>
-        <w:t>Thanutchapat</w:t>
-      </w:r>
-      <w:proofErr w:type="spellEnd"/>
-      <w:r>
-        <w:t xml:space="preserve">, P., </w:t>
-      </w:r>
-      <w:proofErr w:type="spellStart"/>
-      <w:r>
-        <w:t>Phoncharoenwirot</w:t>
-      </w:r>
-      <w:proofErr w:type="spellEnd"/>
-      <w:r>
-        <w:t xml:space="preserve">, C., </w:t>
-      </w:r>
-      <w:proofErr w:type="spellStart"/>
-      <w:r>
-        <w:t>Mekchaiporn</w:t>
-      </w:r>
-      <w:proofErr w:type="spellEnd"/>
-      <w:r>
-        <w:t xml:space="preserve">, O., </w:t>
-      </w:r>
-      <w:proofErr w:type="spellStart"/>
-      <w:r>
-        <w:t>Chienwichai</w:t>
-      </w:r>
-      <w:proofErr w:type="spellEnd"/>
-      <w:r>
-        <w:t xml:space="preserve">, P., &amp; Maude, R. J. (2025). Global spatiotemporal analysis of suicide epidemiology and risk factor associations from 2000 to 2019 using </w:t>
+      <w:r>
+        <w:t xml:space="preserve">Rotejanaprasert, C., Thanutchapat, P., Phoncharoenwirot, C., Mekchaiporn, O., Chienwichai, P., &amp; Maude, R. J. (2025). Global spatiotemporal analysis of suicide epidemiology and risk factor associations from 2000 to 2019 using </w:t>
       </w:r>
       <w:r>
         <w:lastRenderedPageBreak/>
-        <w:t xml:space="preserve">Bayesian space time hierarchical </w:t>
-      </w:r>
-      <w:proofErr w:type="spellStart"/>
-      <w:r>
-        <w:t>modeling</w:t>
-      </w:r>
-      <w:proofErr w:type="spellEnd"/>
-      <w:r>
-        <w:t xml:space="preserve">. </w:t>
+        <w:t xml:space="preserve">Bayesian space time hierarchical modeling. </w:t>
       </w:r>
       <w:r>
         <w:rPr>
@@ -22481,29 +22044,8 @@
       <w:pPr>
         <w:pStyle w:val="Bibliography"/>
       </w:pPr>
-      <w:proofErr w:type="spellStart"/>
-      <w:r>
-        <w:t>Somé</w:t>
-      </w:r>
-      <w:proofErr w:type="spellEnd"/>
-      <w:r>
-        <w:t xml:space="preserve">, N. H., </w:t>
-      </w:r>
-      <w:proofErr w:type="spellStart"/>
-      <w:r>
-        <w:t>Noormohammadpour</w:t>
-      </w:r>
-      <w:proofErr w:type="spellEnd"/>
-      <w:r>
-        <w:t xml:space="preserve">, P., &amp; Lange, S. (2024). The use of machine learning on administrative and survey data to predict suicidal thoughts and </w:t>
-      </w:r>
-      <w:proofErr w:type="spellStart"/>
-      <w:r>
-        <w:t>behaviors</w:t>
-      </w:r>
-      <w:proofErr w:type="spellEnd"/>
-      <w:r>
-        <w:t xml:space="preserve">: A systematic review. </w:t>
+      <w:r>
+        <w:t xml:space="preserve">Somé, N. H., Noormohammadpour, P., &amp; Lange, S. (2024). The use of machine learning on administrative and survey data to predict suicidal thoughts and behaviors: A systematic review. </w:t>
       </w:r>
       <w:r>
         <w:rPr>
@@ -22531,15 +22073,7 @@
         <w:pStyle w:val="Bibliography"/>
       </w:pPr>
       <w:r>
-        <w:t xml:space="preserve">Spittal, M. J., Guo, X. A., Kang, L., Kirtley, O. J., Clapperton, A., Hawton, K., Kapur, N., </w:t>
-      </w:r>
-      <w:proofErr w:type="spellStart"/>
-      <w:r>
-        <w:t>Pirkis</w:t>
-      </w:r>
-      <w:proofErr w:type="spellEnd"/>
-      <w:r>
-        <w:t xml:space="preserve">, J., &amp; Carter, G. (2025). Machine learning algorithms and their predictive accuracy for suicide and self-harm: Systematic review and meta-analysis. </w:t>
+        <w:t xml:space="preserve">Spittal, M. J., Guo, X. A., Kang, L., Kirtley, O. J., Clapperton, A., Hawton, K., Kapur, N., Pirkis, J., &amp; Carter, G. (2025). Machine learning algorithms and their predictive accuracy for suicide and self-harm: Systematic review and meta-analysis. </w:t>
       </w:r>
       <w:r>
         <w:rPr>
@@ -22863,6 +22397,9 @@
       <w:pStyle w:val="Header"/>
     </w:pPr>
     <w:r>
+      <w:rPr>
+        <w:noProof/>
+      </w:rPr>
       <w:drawing>
         <wp:anchor distT="0" distB="0" distL="114300" distR="114300" simplePos="0" relativeHeight="251660288" behindDoc="0" locked="0" layoutInCell="1" allowOverlap="1" wp14:anchorId="4F40A537" wp14:editId="3CCDD148">
           <wp:simplePos x="0" y="0"/>
@@ -22919,6 +22456,7 @@
     </w:r>
     <w:r>
       <w:rPr>
+        <w:noProof/>
         <w:color w:val="0F6FC6" w:themeColor="accent1"/>
         <w:sz w:val="20"/>
         <w:szCs w:val="20"/>
@@ -24485,15 +24023,6 @@
   </w:num>
   <w:num w:numId="14" w16cid:durableId="2090612161">
     <w:abstractNumId w:val="10"/>
-    <w:lvlOverride w:ilvl="0"/>
-    <w:lvlOverride w:ilvl="1"/>
-    <w:lvlOverride w:ilvl="2"/>
-    <w:lvlOverride w:ilvl="3"/>
-    <w:lvlOverride w:ilvl="4"/>
-    <w:lvlOverride w:ilvl="5"/>
-    <w:lvlOverride w:ilvl="6"/>
-    <w:lvlOverride w:ilvl="7"/>
-    <w:lvlOverride w:ilvl="8"/>
   </w:num>
   <w:num w:numId="15" w16cid:durableId="268439870">
     <w:abstractNumId w:val="1"/>
@@ -24557,27 +24086,9 @@
   </w:num>
   <w:num w:numId="17" w16cid:durableId="1838111839">
     <w:abstractNumId w:val="6"/>
-    <w:lvlOverride w:ilvl="0"/>
-    <w:lvlOverride w:ilvl="1"/>
-    <w:lvlOverride w:ilvl="2"/>
-    <w:lvlOverride w:ilvl="3"/>
-    <w:lvlOverride w:ilvl="4"/>
-    <w:lvlOverride w:ilvl="5"/>
-    <w:lvlOverride w:ilvl="6"/>
-    <w:lvlOverride w:ilvl="7"/>
-    <w:lvlOverride w:ilvl="8"/>
   </w:num>
   <w:num w:numId="18" w16cid:durableId="1365248780">
     <w:abstractNumId w:val="5"/>
-    <w:lvlOverride w:ilvl="0"/>
-    <w:lvlOverride w:ilvl="1"/>
-    <w:lvlOverride w:ilvl="2"/>
-    <w:lvlOverride w:ilvl="3"/>
-    <w:lvlOverride w:ilvl="4"/>
-    <w:lvlOverride w:ilvl="5"/>
-    <w:lvlOverride w:ilvl="6"/>
-    <w:lvlOverride w:ilvl="7"/>
-    <w:lvlOverride w:ilvl="8"/>
   </w:num>
   <w:numIdMacAtCleanup w:val="8"/>
 </w:numbering>
@@ -25238,6 +24749,7 @@
   <w:style w:type="character" w:default="1" w:styleId="DefaultParagraphFont">
     <w:name w:val="Default Paragraph Font"/>
     <w:uiPriority w:val="1"/>
+    <w:semiHidden/>
     <w:unhideWhenUsed/>
   </w:style>
   <w:style w:type="table" w:default="1" w:styleId="TableNormal">
@@ -26281,21 +25793,6 @@
 
 <file path=word/glossary/fontTable.xml><?xml version="1.0" encoding="utf-8"?>
 <w:fonts xmlns:mc="http://schemas.openxmlformats.org/markup-compatibility/2006" xmlns:r="http://schemas.openxmlformats.org/officeDocument/2006/relationships" xmlns:w="http://schemas.openxmlformats.org/wordprocessingml/2006/main" xmlns:w14="http://schemas.microsoft.com/office/word/2010/wordml" xmlns:w15="http://schemas.microsoft.com/office/word/2012/wordml" xmlns:w16cex="http://schemas.microsoft.com/office/word/2018/wordml/cex" xmlns:w16cid="http://schemas.microsoft.com/office/word/2016/wordml/cid" xmlns:w16="http://schemas.microsoft.com/office/word/2018/wordml" xmlns:w16du="http://schemas.microsoft.com/office/word/2023/wordml/word16du" xmlns:w16sdtdh="http://schemas.microsoft.com/office/word/2020/wordml/sdtdatahash" xmlns:w16sdtfl="http://schemas.microsoft.com/office/word/2024/wordml/sdtformatlock" xmlns:w16se="http://schemas.microsoft.com/office/word/2015/wordml/symex" mc:Ignorable="w14 w15 w16se w16cid w16 w16cex w16sdtdh w16sdtfl w16du">
-  <w:font w:name="Tw Cen MT">
-    <w:panose1 w:val="020B0602020104020603"/>
-    <w:charset w:val="00"/>
-    <w:family w:val="swiss"/>
-    <w:pitch w:val="variable"/>
-    <w:sig w:usb0="00000007" w:usb1="00000000" w:usb2="00000000" w:usb3="00000000" w:csb0="00000003" w:csb1="00000000"/>
-  </w:font>
-  <w:font w:name="SimSun">
-    <w:altName w:val="宋体"/>
-    <w:panose1 w:val="02010600030101010101"/>
-    <w:charset w:val="86"/>
-    <w:family w:val="auto"/>
-    <w:pitch w:val="variable"/>
-    <w:sig w:usb0="00000203" w:usb1="288F0000" w:usb2="00000016" w:usb3="00000000" w:csb0="00040001" w:csb1="00000000"/>
-  </w:font>
   <w:font w:name="Times New Roman">
     <w:panose1 w:val="02020603050405020304"/>
     <w:charset w:val="00"/>
@@ -26323,6 +25820,21 @@
     <w:family w:val="modern"/>
     <w:pitch w:val="fixed"/>
     <w:sig w:usb0="E0002EFF" w:usb1="C0007843" w:usb2="00000009" w:usb3="00000000" w:csb0="000001FF" w:csb1="00000000"/>
+  </w:font>
+  <w:font w:name="Tw Cen MT">
+    <w:panose1 w:val="020B0602020104020603"/>
+    <w:charset w:val="00"/>
+    <w:family w:val="swiss"/>
+    <w:pitch w:val="variable"/>
+    <w:sig w:usb0="00000007" w:usb1="00000000" w:usb2="00000000" w:usb3="00000000" w:csb0="00000003" w:csb1="00000000"/>
+  </w:font>
+  <w:font w:name="SimSun">
+    <w:altName w:val="宋体"/>
+    <w:panose1 w:val="02010600030101010101"/>
+    <w:charset w:val="86"/>
+    <w:family w:val="auto"/>
+    <w:pitch w:val="variable"/>
+    <w:sig w:usb0="00000203" w:usb1="288F0000" w:usb2="00000016" w:usb3="00000000" w:csb0="00040001" w:csb1="00000000"/>
   </w:font>
   <w:font w:name="Roboto">
     <w:charset w:val="00"/>
@@ -26439,11 +25951,13 @@
     <w:rsid w:val="00B76F52"/>
     <w:rsid w:val="00B80527"/>
     <w:rsid w:val="00B920C9"/>
+    <w:rsid w:val="00BD46A7"/>
     <w:rsid w:val="00BE5925"/>
     <w:rsid w:val="00C968F6"/>
     <w:rsid w:val="00D97409"/>
     <w:rsid w:val="00E03C1A"/>
     <w:rsid w:val="00E77366"/>
+    <w:rsid w:val="00F4030C"/>
     <w:rsid w:val="00F70D56"/>
     <w:rsid w:val="00FB7CD8"/>
   </w:rsids>

</xml_diff>